<commit_message>
Include the seed deck PDF in each investor mail folder.
Keep product demo as a link later, not a video attachment that mail filters will drop.

Co-authored-by: Cursor <cursoragent@cursor.com>
</commit_message>
<xml_diff>
--- a/docs/seed-round-202609/各机构邮件模板.docx
+++ b/docs/seed-round-202609/各机构邮件模板.docx
@@ -31,7 +31,7 @@
         <w:rPr>
           <w:rFonts w:hint="eastAsia"/>
         </w:rPr>
-        <w:t xml:space="preserve">附件统一两份：</w:t>
+        <w:t xml:space="preserve">附件统一三份：</w:t>
       </w:r>
       <w:r>
         <w:rPr>
@@ -54,7 +54,38 @@
           <w:rStyle w:val="VerbatimChar"/>
           <w:rFonts w:hint="eastAsia"/>
         </w:rPr>
-        <w:t xml:space="preserve">灵祺种子轮-投资人备忘录</w:t>
+        <w:t xml:space="preserve">投资人备忘录</w:t>
+      </w:r>
+      <w:r>
+        <w:t xml:space="preserve"> </w:t>
+      </w:r>
+      <w:r>
+        <w:t xml:space="preserve">+</w:t>
+      </w:r>
+      <w:r>
+        <w:t xml:space="preserve"> </w:t>
+      </w:r>
+      <w:r>
+        <w:rPr>
+          <w:rStyle w:val="VerbatimChar"/>
+          <w:rFonts w:hint="eastAsia"/>
+        </w:rPr>
+        <w:t xml:space="preserve">路演PPT.pdf</w:t>
+      </w:r>
+      <w:r>
+        <w:rPr>
+          <w:rFonts w:hint="eastAsia"/>
+        </w:rPr>
+        <w:t xml:space="preserve">（不要发</w:t>
+      </w:r>
+      <w:r>
+        <w:t xml:space="preserve"> </w:t>
+      </w:r>
+      <w:r>
+        <w:rPr>
+          <w:rFonts w:hint="eastAsia"/>
+        </w:rPr>
+        <w:t xml:space="preserve">pptx）。产品演示视频不要当附件，有成片后用飞书/网盘链接。</w:t>
       </w:r>
       <w:r>
         <w:br/>
@@ -548,7 +579,20 @@
           <w:rStyle w:val="VerbatimChar"/>
           <w:rFonts w:hint="eastAsia"/>
         </w:rPr>
-        <w:t xml:space="preserve">附件为一页纸和备忘录。正式材料将同步在宁波科技大脑提交。若方便，想占用</w:t>
+        <w:t xml:space="preserve">附件为一页纸、备忘录和路演</w:t>
+      </w:r>
+      <w:r>
+        <w:rPr>
+          <w:rStyle w:val="VerbatimChar"/>
+        </w:rPr>
+        <w:t xml:space="preserve"> </w:t>
+      </w:r>
+      <w:r>
+        <w:rPr>
+          <w:rStyle w:val="VerbatimChar"/>
+          <w:rFonts w:hint="eastAsia"/>
+        </w:rPr>
+        <w:t xml:space="preserve">PDF。正式材料将同步在宁波科技大脑提交。若方便，想占用</w:t>
       </w:r>
       <w:r>
         <w:rPr>
@@ -1175,7 +1219,20 @@
           <w:rStyle w:val="VerbatimChar"/>
           <w:rFonts w:hint="eastAsia"/>
         </w:rPr>
-        <w:t xml:space="preserve">万，战场只在杭甬温。官网申请表已同步提交。附件是一页纸和备忘录，方便时想演示主链路。</w:t>
+        <w:t xml:space="preserve">万，战场只在杭甬温。官网申请表已同步提交。附件为一页纸、备忘录和路演</w:t>
+      </w:r>
+      <w:r>
+        <w:rPr>
+          <w:rStyle w:val="VerbatimChar"/>
+        </w:rPr>
+        <w:t xml:space="preserve"> </w:t>
+      </w:r>
+      <w:r>
+        <w:rPr>
+          <w:rStyle w:val="VerbatimChar"/>
+          <w:rFonts w:hint="eastAsia"/>
+        </w:rPr>
+        <w:t xml:space="preserve">PDF，方便时想演示主链路。</w:t>
       </w:r>
       <w:r>
         <w:br/>
@@ -1669,7 +1726,13 @@
           <w:rStyle w:val="VerbatimChar"/>
           <w:rFonts w:hint="eastAsia"/>
         </w:rPr>
-        <w:t xml:space="preserve">万店。已在贵机构八问提交，附件为一页纸和备忘录。</w:t>
+        <w:t xml:space="preserve">万店。已在贵机构八问提交，附件为一页纸、备忘录和路演</w:t>
+      </w:r>
+      <w:r>
+        <w:rPr>
+          <w:rStyle w:val="VerbatimChar"/>
+        </w:rPr>
+        <w:t xml:space="preserve"> PDF。</w:t>
       </w:r>
       <w:r>
         <w:br/>
@@ -2228,7 +2291,20 @@
           <w:rStyle w:val="VerbatimChar"/>
           <w:rFonts w:hint="eastAsia"/>
         </w:rPr>
-        <w:t xml:space="preserve">附件为一页纸和备忘录。若方便，想占用</w:t>
+        <w:t xml:space="preserve">附件为一页纸、备忘录和路演</w:t>
+      </w:r>
+      <w:r>
+        <w:rPr>
+          <w:rStyle w:val="VerbatimChar"/>
+        </w:rPr>
+        <w:t xml:space="preserve"> </w:t>
+      </w:r>
+      <w:r>
+        <w:rPr>
+          <w:rStyle w:val="VerbatimChar"/>
+          <w:rFonts w:hint="eastAsia"/>
+        </w:rPr>
+        <w:t xml:space="preserve">PDF。若方便，想占用</w:t>
       </w:r>
       <w:r>
         <w:rPr>
@@ -2650,7 +2726,20 @@
           <w:rStyle w:val="VerbatimChar"/>
           <w:rFonts w:hint="eastAsia"/>
         </w:rPr>
-        <w:t xml:space="preserve">万，只做杭甬温。附件是一页纸和备忘录，方便时想演示「ERP</w:t>
+        <w:t xml:space="preserve">万，只做杭甬温。附件为一页纸、备忘录和路演</w:t>
+      </w:r>
+      <w:r>
+        <w:rPr>
+          <w:rStyle w:val="VerbatimChar"/>
+        </w:rPr>
+        <w:t xml:space="preserve"> </w:t>
+      </w:r>
+      <w:r>
+        <w:rPr>
+          <w:rStyle w:val="VerbatimChar"/>
+          <w:rFonts w:hint="eastAsia"/>
+        </w:rPr>
+        <w:t xml:space="preserve">PDF，方便时想演示「ERP</w:t>
       </w:r>
       <w:r>
         <w:rPr>
@@ -3129,7 +3218,20 @@
           <w:rStyle w:val="VerbatimChar"/>
           <w:rFonts w:hint="eastAsia"/>
         </w:rPr>
-        <w:t xml:space="preserve">万，战场杭甬温。附件为一页纸和备忘录，希望占用</w:t>
+        <w:t xml:space="preserve">万，战场杭甬温。附件为一页纸、备忘录和路演</w:t>
+      </w:r>
+      <w:r>
+        <w:rPr>
+          <w:rStyle w:val="VerbatimChar"/>
+        </w:rPr>
+        <w:t xml:space="preserve"> </w:t>
+      </w:r>
+      <w:r>
+        <w:rPr>
+          <w:rStyle w:val="VerbatimChar"/>
+          <w:rFonts w:hint="eastAsia"/>
+        </w:rPr>
+        <w:t xml:space="preserve">PDF，希望占用</w:t>
       </w:r>
       <w:r>
         <w:rPr>
@@ -3589,7 +3691,13 @@
           <w:rStyle w:val="VerbatimChar"/>
           <w:rFonts w:hint="eastAsia"/>
         </w:rPr>
-        <w:t xml:space="preserve">讲故事。附件为一页纸和备忘录。</w:t>
+        <w:t xml:space="preserve">讲故事。附件为一页纸、备忘录和路演</w:t>
+      </w:r>
+      <w:r>
+        <w:rPr>
+          <w:rStyle w:val="VerbatimChar"/>
+        </w:rPr>
+        <w:t xml:space="preserve"> PDF。</w:t>
       </w:r>
       <w:r>
         <w:br/>
@@ -4118,7 +4226,20 @@
           <w:rStyle w:val="VerbatimChar"/>
           <w:rFonts w:hint="eastAsia"/>
         </w:rPr>
-        <w:t xml:space="preserve">万，先在杭甬温把单位经济做审计。附件为一页纸和备忘录，方便时演示主链路。</w:t>
+        <w:t xml:space="preserve">万，先在杭甬温把单位经济做审计。附件为一页纸、备忘录和路演</w:t>
+      </w:r>
+      <w:r>
+        <w:rPr>
+          <w:rStyle w:val="VerbatimChar"/>
+        </w:rPr>
+        <w:t xml:space="preserve"> </w:t>
+      </w:r>
+      <w:r>
+        <w:rPr>
+          <w:rStyle w:val="VerbatimChar"/>
+          <w:rFonts w:hint="eastAsia"/>
+        </w:rPr>
+        <w:t xml:space="preserve">PDF，方便时演示主链路。</w:t>
       </w:r>
       <w:r>
         <w:br/>
@@ -4601,7 +4722,20 @@
           <w:rStyle w:val="VerbatimChar"/>
           <w:rFonts w:hint="eastAsia"/>
         </w:rPr>
-        <w:t xml:space="preserve">万。主体虽在宁波，温州已是可验证的单城供给样板。附件为一页纸和备忘录，希望有机会当面汇报。</w:t>
+        <w:t xml:space="preserve">万。主体虽在宁波，温州已是可验证的单城供给样板。附件为一页纸、备忘录和路演</w:t>
+      </w:r>
+      <w:r>
+        <w:rPr>
+          <w:rStyle w:val="VerbatimChar"/>
+        </w:rPr>
+        <w:t xml:space="preserve"> </w:t>
+      </w:r>
+      <w:r>
+        <w:rPr>
+          <w:rStyle w:val="VerbatimChar"/>
+          <w:rFonts w:hint="eastAsia"/>
+        </w:rPr>
+        <w:t xml:space="preserve">PDF，希望有机会当面汇报。</w:t>
       </w:r>
       <w:r>
         <w:br/>
@@ -4948,7 +5082,20 @@
           <w:rStyle w:val="VerbatimChar"/>
           <w:rFonts w:hint="eastAsia"/>
         </w:rPr>
-        <w:t xml:space="preserve">附件为一页纸和备忘录。若方便，想申请</w:t>
+        <w:t xml:space="preserve">附件为一页纸、备忘录和路演</w:t>
+      </w:r>
+      <w:r>
+        <w:rPr>
+          <w:rStyle w:val="VerbatimChar"/>
+        </w:rPr>
+        <w:t xml:space="preserve"> </w:t>
+      </w:r>
+      <w:r>
+        <w:rPr>
+          <w:rStyle w:val="VerbatimChar"/>
+          <w:rFonts w:hint="eastAsia"/>
+        </w:rPr>
+        <w:t xml:space="preserve">PDF。若方便，想申请</w:t>
       </w:r>
       <w:r>
         <w:rPr>
@@ -5361,7 +5508,13 @@
           <w:rStyle w:val="VerbatimChar"/>
           <w:rFonts w:hint="eastAsia"/>
         </w:rPr>
-        <w:t xml:space="preserve">个月把订阅、履约、服务商导入做成可审计单位经济。附件为一页纸和备忘录。</w:t>
+        <w:t xml:space="preserve">个月把订阅、履约、服务商导入做成可审计单位经济。附件为一页纸、备忘录和路演</w:t>
+      </w:r>
+      <w:r>
+        <w:rPr>
+          <w:rStyle w:val="VerbatimChar"/>
+        </w:rPr>
+        <w:t xml:space="preserve"> PDF。</w:t>
       </w:r>
       <w:r>
         <w:br/>
@@ -5643,7 +5796,20 @@
           <w:rStyle w:val="VerbatimChar"/>
           <w:rFonts w:hint="eastAsia"/>
         </w:rPr>
-        <w:t xml:space="preserve">附件为一页纸和备忘录。若方便，想当面用</w:t>
+        <w:t xml:space="preserve">附件为一页纸、备忘录和路演</w:t>
+      </w:r>
+      <w:r>
+        <w:rPr>
+          <w:rStyle w:val="VerbatimChar"/>
+        </w:rPr>
+        <w:t xml:space="preserve"> </w:t>
+      </w:r>
+      <w:r>
+        <w:rPr>
+          <w:rStyle w:val="VerbatimChar"/>
+          <w:rFonts w:hint="eastAsia"/>
+        </w:rPr>
+        <w:t xml:space="preserve">PDF。若方便，想当面用</w:t>
       </w:r>
       <w:r>
         <w:rPr>

</xml_diff>

<commit_message>
Add the company email to investor-facing seed contacts.
Keep the change local only; do not push remotes this round.

Co-authored-by: Cursor <cursoragent@cursor.com>
</commit_message>
<xml_diff>
--- a/docs/seed-round-202609/各机构邮件模板.docx
+++ b/docs/seed-round-202609/各机构邮件模板.docx
@@ -655,6 +655,15 @@
         </w:rPr>
         <w:t xml:space="preserve">15757468650</w:t>
       </w:r>
+      <w:r>
+        <w:br/>
+      </w:r>
+      <w:r>
+        <w:rPr>
+          <w:rStyle w:val="VerbatimChar"/>
+        </w:rPr>
+        <w:t xml:space="preserve">modian@mofangdianai.com</w:t>
+      </w:r>
     </w:p>
     <w:p>
       <w:r>
@@ -1256,6 +1265,15 @@
         </w:rPr>
         <w:t xml:space="preserve">15757468650</w:t>
       </w:r>
+      <w:r>
+        <w:br/>
+      </w:r>
+      <w:r>
+        <w:rPr>
+          <w:rStyle w:val="VerbatimChar"/>
+        </w:rPr>
+        <w:t xml:space="preserve">modian@mofangdianai.com</w:t>
+      </w:r>
     </w:p>
     <w:p>
       <w:r>
@@ -1756,6 +1774,15 @@
         </w:rPr>
         <w:t xml:space="preserve">15757468650</w:t>
       </w:r>
+      <w:r>
+        <w:br/>
+      </w:r>
+      <w:r>
+        <w:rPr>
+          <w:rStyle w:val="VerbatimChar"/>
+        </w:rPr>
+        <w:t xml:space="preserve">modian@mofangdianai.com</w:t>
+      </w:r>
     </w:p>
     <w:p>
       <w:r>
@@ -2341,6 +2368,15 @@
         </w:rPr>
         <w:t xml:space="preserve">15757468650</w:t>
       </w:r>
+      <w:r>
+        <w:br/>
+      </w:r>
+      <w:r>
+        <w:rPr>
+          <w:rStyle w:val="VerbatimChar"/>
+        </w:rPr>
+        <w:t xml:space="preserve">modian@mofangdianai.com</w:t>
+      </w:r>
     </w:p>
     <w:p>
       <w:r>
@@ -2789,6 +2825,15 @@
         </w:rPr>
         <w:t xml:space="preserve">15757468650</w:t>
       </w:r>
+      <w:r>
+        <w:br/>
+      </w:r>
+      <w:r>
+        <w:rPr>
+          <w:rStyle w:val="VerbatimChar"/>
+        </w:rPr>
+        <w:t xml:space="preserve">modian@mofangdianai.com</w:t>
+      </w:r>
     </w:p>
     <w:p>
       <w:r>
@@ -3268,6 +3313,15 @@
         </w:rPr>
         <w:t xml:space="preserve">15757468650</w:t>
       </w:r>
+      <w:r>
+        <w:br/>
+      </w:r>
+      <w:r>
+        <w:rPr>
+          <w:rStyle w:val="VerbatimChar"/>
+        </w:rPr>
+        <w:t xml:space="preserve">modian@mofangdianai.com</w:t>
+      </w:r>
     </w:p>
     <w:p>
       <w:r>
@@ -3721,6 +3775,15 @@
         </w:rPr>
         <w:t xml:space="preserve">15757468650</w:t>
       </w:r>
+      <w:r>
+        <w:br/>
+      </w:r>
+      <w:r>
+        <w:rPr>
+          <w:rStyle w:val="VerbatimChar"/>
+        </w:rPr>
+        <w:t xml:space="preserve">modian@mofangdianai.com</w:t>
+      </w:r>
     </w:p>
     <w:p>
       <w:r>
@@ -4263,6 +4326,15 @@
         </w:rPr>
         <w:t xml:space="preserve">15757468650</w:t>
       </w:r>
+      <w:r>
+        <w:br/>
+      </w:r>
+      <w:r>
+        <w:rPr>
+          <w:rStyle w:val="VerbatimChar"/>
+        </w:rPr>
+        <w:t xml:space="preserve">modian@mofangdianai.com</w:t>
+      </w:r>
     </w:p>
     <w:p>
       <w:r>
@@ -4759,6 +4831,15 @@
         </w:rPr>
         <w:t xml:space="preserve">15757468650</w:t>
       </w:r>
+      <w:r>
+        <w:br/>
+      </w:r>
+      <w:r>
+        <w:rPr>
+          <w:rStyle w:val="VerbatimChar"/>
+        </w:rPr>
+        <w:t xml:space="preserve">modian@mofangdianai.com</w:t>
+      </w:r>
     </w:p>
     <w:p>
       <w:r>
@@ -5132,6 +5213,15 @@
         </w:rPr>
         <w:t xml:space="preserve">15757468650</w:t>
       </w:r>
+      <w:r>
+        <w:br/>
+      </w:r>
+      <w:r>
+        <w:rPr>
+          <w:rStyle w:val="VerbatimChar"/>
+        </w:rPr>
+        <w:t xml:space="preserve">modian@mofangdianai.com</w:t>
+      </w:r>
     </w:p>
     <w:p>
       <w:r>
@@ -5538,6 +5628,15 @@
         </w:rPr>
         <w:t xml:space="preserve">15757468650</w:t>
       </w:r>
+      <w:r>
+        <w:br/>
+      </w:r>
+      <w:r>
+        <w:rPr>
+          <w:rStyle w:val="VerbatimChar"/>
+        </w:rPr>
+        <w:t xml:space="preserve">modian@mofangdianai.com</w:t>
+      </w:r>
     </w:p>
     <w:p>
       <w:r>
@@ -5846,6 +5945,15 @@
         </w:rPr>
         <w:t xml:space="preserve">15757468650</w:t>
       </w:r>
+      <w:r>
+        <w:br/>
+      </w:r>
+      <w:r>
+        <w:rPr>
+          <w:rStyle w:val="VerbatimChar"/>
+        </w:rPr>
+        <w:t xml:space="preserve">modian@mofangdianai.com</w:t>
+      </w:r>
     </w:p>
     <w:p>
       <w:r>
@@ -6007,7 +6115,7 @@
         <w:rPr>
           <w:rStyle w:val="VerbatimChar"/>
         </w:rPr>
-        <w:t xml:space="preserve">  15757468650</w:t>
+        <w:t xml:space="preserve">  15757468650  modian@mofangdianai.com</w:t>
       </w:r>
     </w:p>
     <w:bookmarkEnd w:id="21"/>

</xml_diff>

<commit_message>
Call the product AI ERP in outreach mail, not SaaS.
Put AI ERP in every subject line so the first scan matches how the company positions itself.

Co-authored-by: Cursor <cursoragent@cursor.com>
</commit_message>
<xml_diff>
--- a/docs/seed-round-202609/各机构邮件模板.docx
+++ b/docs/seed-round-202609/各机构邮件模板.docx
@@ -782,7 +782,7 @@
         <w:rPr>
           <w:rStyle w:val="VerbatimChar"/>
         </w:rPr>
-        <w:t xml:space="preserve"> Merchant AI Agent + </w:t>
+        <w:t xml:space="preserve"> AI ERP + </w:t>
       </w:r>
       <w:r>
         <w:rPr>
@@ -846,40 +846,27 @@
         <w:rPr>
           <w:rStyle w:val="VerbatimChar"/>
         </w:rPr>
-        <w:t xml:space="preserve"> Merchant AI </w:t>
-      </w:r>
-      <w:r>
-        <w:rPr>
-          <w:rStyle w:val="VerbatimChar"/>
-          <w:rFonts w:hint="eastAsia"/>
-        </w:rPr>
-        <w:t xml:space="preserve">Agent，不是聊天机器人：AI</w:t>
-      </w:r>
-      <w:r>
-        <w:rPr>
-          <w:rStyle w:val="VerbatimChar"/>
-        </w:rPr>
-        <w:t xml:space="preserve"> </w:t>
-      </w:r>
-      <w:r>
-        <w:rPr>
-          <w:rStyle w:val="VerbatimChar"/>
-          <w:rFonts w:hint="eastAsia"/>
-        </w:rPr>
-        <w:t xml:space="preserve">给出组品、Brief、店铺分析和短视频方案，商户预览确认后再写入</w:t>
-      </w:r>
-      <w:r>
-        <w:rPr>
-          <w:rStyle w:val="VerbatimChar"/>
-        </w:rPr>
-        <w:t xml:space="preserve"> </w:t>
-      </w:r>
-      <w:r>
-        <w:rPr>
-          <w:rStyle w:val="VerbatimChar"/>
-          <w:rFonts w:hint="eastAsia"/>
-        </w:rPr>
-        <w:t xml:space="preserve">ERP；达人侧用「灵祺星选」完成招募、报名、探店</w:t>
+        <w:t xml:space="preserve"> AI </w:t>
+      </w:r>
+      <w:r>
+        <w:rPr>
+          <w:rStyle w:val="VerbatimChar"/>
+          <w:rFonts w:hint="eastAsia"/>
+        </w:rPr>
+        <w:t xml:space="preserve">ERP，不是聊天机器人：AI</w:t>
+      </w:r>
+      <w:r>
+        <w:rPr>
+          <w:rStyle w:val="VerbatimChar"/>
+        </w:rPr>
+        <w:t xml:space="preserve"> </w:t>
+      </w:r>
+      <w:r>
+        <w:rPr>
+          <w:rStyle w:val="VerbatimChar"/>
+          <w:rFonts w:hint="eastAsia"/>
+        </w:rPr>
+        <w:t xml:space="preserve">给出组品、Brief、店铺分析和短视频方案，商户预览确认后再写入系统；达人侧用「灵祺星选」完成招募、报名、探店</w:t>
       </w:r>
       <w:r>
         <w:rPr>
@@ -1357,20 +1344,7 @@
           <w:rStyle w:val="VerbatimChar"/>
           <w:rFonts w:hint="eastAsia"/>
         </w:rPr>
-        <w:t xml:space="preserve">【种子轮</w:t>
-      </w:r>
-      <w:r>
-        <w:rPr>
-          <w:rStyle w:val="VerbatimChar"/>
-        </w:rPr>
-        <w:t xml:space="preserve"> 400 </w:t>
-      </w:r>
-      <w:r>
-        <w:rPr>
-          <w:rStyle w:val="VerbatimChar"/>
-          <w:rFonts w:hint="eastAsia"/>
-        </w:rPr>
-        <w:t xml:space="preserve">万】宁波墨典</w:t>
+        <w:t xml:space="preserve">【种子轮】宁波墨典</w:t>
       </w:r>
       <w:r>
         <w:rPr>
@@ -1383,20 +1357,20 @@
           <w:rStyle w:val="VerbatimChar"/>
           <w:rFonts w:hint="eastAsia"/>
         </w:rPr>
-        <w:t xml:space="preserve">灵祺：商家</w:t>
-      </w:r>
-      <w:r>
-        <w:rPr>
-          <w:rStyle w:val="VerbatimChar"/>
-        </w:rPr>
-        <w:t xml:space="preserve"> ERP </w:t>
-      </w:r>
-      <w:r>
-        <w:rPr>
-          <w:rStyle w:val="VerbatimChar"/>
-          <w:rFonts w:hint="eastAsia"/>
-        </w:rPr>
-        <w:t xml:space="preserve">已同步</w:t>
+        <w:t xml:space="preserve">灵祺</w:t>
+      </w:r>
+      <w:r>
+        <w:rPr>
+          <w:rStyle w:val="VerbatimChar"/>
+        </w:rPr>
+        <w:t xml:space="preserve"> AI </w:t>
+      </w:r>
+      <w:r>
+        <w:rPr>
+          <w:rStyle w:val="VerbatimChar"/>
+          <w:rFonts w:hint="eastAsia"/>
+        </w:rPr>
+        <w:t xml:space="preserve">ERP：已同步</w:t>
       </w:r>
       <w:r>
         <w:rPr>
@@ -1409,7 +1383,7 @@
           <w:rStyle w:val="VerbatimChar"/>
           <w:rFonts w:hint="eastAsia"/>
         </w:rPr>
-        <w:t xml:space="preserve">万单，星选侧</w:t>
+        <w:t xml:space="preserve">万单，星选</w:t>
       </w:r>
       <w:r>
         <w:rPr>
@@ -1882,20 +1856,7 @@
           <w:rStyle w:val="VerbatimChar"/>
           <w:rFonts w:hint="eastAsia"/>
         </w:rPr>
-        <w:t xml:space="preserve">【种子轮</w:t>
-      </w:r>
-      <w:r>
-        <w:rPr>
-          <w:rStyle w:val="VerbatimChar"/>
-        </w:rPr>
-        <w:t xml:space="preserve"> 400 </w:t>
-      </w:r>
-      <w:r>
-        <w:rPr>
-          <w:rStyle w:val="VerbatimChar"/>
-          <w:rFonts w:hint="eastAsia"/>
-        </w:rPr>
-        <w:t xml:space="preserve">万】宁波墨典</w:t>
+        <w:t xml:space="preserve">【种子轮】宁波墨典</w:t>
       </w:r>
       <w:r>
         <w:rPr>
@@ -1908,7 +1869,20 @@
           <w:rStyle w:val="VerbatimChar"/>
           <w:rFonts w:hint="eastAsia"/>
         </w:rPr>
-        <w:t xml:space="preserve">灵祺：杭甬温商家数字化</w:t>
+        <w:t xml:space="preserve">灵祺</w:t>
+      </w:r>
+      <w:r>
+        <w:rPr>
+          <w:rStyle w:val="VerbatimChar"/>
+        </w:rPr>
+        <w:t xml:space="preserve"> AI </w:t>
+      </w:r>
+      <w:r>
+        <w:rPr>
+          <w:rStyle w:val="VerbatimChar"/>
+          <w:rFonts w:hint="eastAsia"/>
+        </w:rPr>
+        <w:t xml:space="preserve">ERP：杭甬温商家经营</w:t>
       </w:r>
       <w:r>
         <w:rPr>
@@ -2459,7 +2433,7 @@
           <w:rStyle w:val="VerbatimChar"/>
           <w:rFonts w:hint="eastAsia"/>
         </w:rPr>
-        <w:t xml:space="preserve">【BP】灵祺智能</w:t>
+        <w:t xml:space="preserve">【种子轮】灵祺</w:t>
       </w:r>
       <w:r>
         <w:rPr>
@@ -2472,20 +2446,20 @@
           <w:rStyle w:val="VerbatimChar"/>
           <w:rFonts w:hint="eastAsia"/>
         </w:rPr>
-        <w:t xml:space="preserve">种子轮</w:t>
-      </w:r>
-      <w:r>
-        <w:rPr>
-          <w:rStyle w:val="VerbatimChar"/>
-        </w:rPr>
-        <w:t xml:space="preserve"> · </w:t>
-      </w:r>
-      <w:r>
-        <w:rPr>
-          <w:rStyle w:val="VerbatimChar"/>
-          <w:rFonts w:hint="eastAsia"/>
-        </w:rPr>
-        <w:t xml:space="preserve">供需双边已在生产环境跑通，付费正在起步</w:t>
+        <w:t xml:space="preserve">本地生活</w:t>
+      </w:r>
+      <w:r>
+        <w:rPr>
+          <w:rStyle w:val="VerbatimChar"/>
+        </w:rPr>
+        <w:t xml:space="preserve"> AI ERP + </w:t>
+      </w:r>
+      <w:r>
+        <w:rPr>
+          <w:rStyle w:val="VerbatimChar"/>
+          <w:rFonts w:hint="eastAsia"/>
+        </w:rPr>
+        <w:t xml:space="preserve">星选履约｜供需已在生产环境跑通</w:t>
       </w:r>
     </w:p>
     <w:p>
@@ -2973,7 +2947,7 @@
         <w:rPr>
           <w:rStyle w:val="VerbatimChar"/>
         </w:rPr>
-        <w:t xml:space="preserve"> Merchant AI Agent + </w:t>
+        <w:t xml:space="preserve"> AI ERP + </w:t>
       </w:r>
       <w:r>
         <w:rPr>
@@ -3024,27 +2998,14 @@
         <w:rPr>
           <w:rStyle w:val="VerbatimChar"/>
         </w:rPr>
-        <w:t xml:space="preserve"> Merchant AI </w:t>
-      </w:r>
-      <w:r>
-        <w:rPr>
-          <w:rStyle w:val="VerbatimChar"/>
-          <w:rFonts w:hint="eastAsia"/>
-        </w:rPr>
-        <w:t xml:space="preserve">Agent：方案预览确认后写入</w:t>
-      </w:r>
-      <w:r>
-        <w:rPr>
-          <w:rStyle w:val="VerbatimChar"/>
-        </w:rPr>
-        <w:t xml:space="preserve"> </w:t>
-      </w:r>
-      <w:r>
-        <w:rPr>
-          <w:rStyle w:val="VerbatimChar"/>
-          <w:rFonts w:hint="eastAsia"/>
-        </w:rPr>
-        <w:t xml:space="preserve">ERP，再通过星选小程序完成达人履约。不是再惠那样的高客单代运营，也不是通告墙。</w:t>
+        <w:t xml:space="preserve"> AI </w:t>
+      </w:r>
+      <w:r>
+        <w:rPr>
+          <w:rStyle w:val="VerbatimChar"/>
+          <w:rFonts w:hint="eastAsia"/>
+        </w:rPr>
+        <w:t xml:space="preserve">ERP：方案预览确认后写入系统，再通过星选小程序完成达人履约。不是再惠那样的高客单代运营，也不是通告墙。</w:t>
       </w:r>
       <w:r>
         <w:br/>
@@ -3404,7 +3365,7 @@
           <w:rStyle w:val="VerbatimChar"/>
           <w:rFonts w:hint="eastAsia"/>
         </w:rPr>
-        <w:t xml:space="preserve">【BP】灵祺</w:t>
+        <w:t xml:space="preserve">【种子轮】灵祺</w:t>
       </w:r>
       <w:r>
         <w:rPr>
@@ -3417,46 +3378,20 @@
           <w:rStyle w:val="VerbatimChar"/>
           <w:rFonts w:hint="eastAsia"/>
         </w:rPr>
-        <w:t xml:space="preserve">种子轮</w:t>
-      </w:r>
-      <w:r>
-        <w:rPr>
-          <w:rStyle w:val="VerbatimChar"/>
-        </w:rPr>
-        <w:t xml:space="preserve"> · </w:t>
-      </w:r>
-      <w:r>
-        <w:rPr>
-          <w:rStyle w:val="VerbatimChar"/>
-          <w:rFonts w:hint="eastAsia"/>
-        </w:rPr>
-        <w:t xml:space="preserve">餐饮</w:t>
-      </w:r>
-      <w:r>
-        <w:rPr>
-          <w:rStyle w:val="VerbatimChar"/>
-        </w:rPr>
-        <w:t xml:space="preserve"> / </w:t>
-      </w:r>
-      <w:r>
-        <w:rPr>
-          <w:rStyle w:val="VerbatimChar"/>
-          <w:rFonts w:hint="eastAsia"/>
-        </w:rPr>
         <w:t xml:space="preserve">本地生活</w:t>
       </w:r>
       <w:r>
         <w:rPr>
           <w:rStyle w:val="VerbatimChar"/>
         </w:rPr>
-        <w:t xml:space="preserve"> SaaS </w:t>
-      </w:r>
-      <w:r>
-        <w:rPr>
-          <w:rStyle w:val="VerbatimChar"/>
-          <w:rFonts w:hint="eastAsia"/>
-        </w:rPr>
-        <w:t xml:space="preserve">续费口径，而不是撮合</w:t>
+        <w:t xml:space="preserve"> AI </w:t>
+      </w:r>
+      <w:r>
+        <w:rPr>
+          <w:rStyle w:val="VerbatimChar"/>
+          <w:rFonts w:hint="eastAsia"/>
+        </w:rPr>
+        <w:t xml:space="preserve">ERP｜续费与服务商导入，不是撮合</w:t>
       </w:r>
       <w:r>
         <w:rPr>
@@ -3500,20 +3435,20 @@
           <w:rStyle w:val="VerbatimChar"/>
           <w:rFonts w:hint="eastAsia"/>
         </w:rPr>
-        <w:t xml:space="preserve">灵祺是本地生活商家和服务商的经营</w:t>
-      </w:r>
-      <w:r>
-        <w:rPr>
-          <w:rStyle w:val="VerbatimChar"/>
-        </w:rPr>
-        <w:t xml:space="preserve"> </w:t>
-      </w:r>
-      <w:r>
-        <w:rPr>
-          <w:rStyle w:val="VerbatimChar"/>
-          <w:rFonts w:hint="eastAsia"/>
-        </w:rPr>
-        <w:t xml:space="preserve">SaaS，加上可验证的达人履约。服务商版已有塔塔、极道、杭州意米、意米文化等租户；其中塔塔、极道、地锅鸡三家已把抖音来客订单同步进</w:t>
+        <w:t xml:space="preserve">灵祺是本地生活商家和服务商的</w:t>
+      </w:r>
+      <w:r>
+        <w:rPr>
+          <w:rStyle w:val="VerbatimChar"/>
+        </w:rPr>
+        <w:t xml:space="preserve"> AI </w:t>
+      </w:r>
+      <w:r>
+        <w:rPr>
+          <w:rStyle w:val="VerbatimChar"/>
+          <w:rFonts w:hint="eastAsia"/>
+        </w:rPr>
+        <w:t xml:space="preserve">ERP，加上可验证的达人履约。服务商版已有塔塔、极道、杭州意米、意米文化等租户；其中塔塔、极道、地锅鸡三家已把抖音来客订单同步进</w:t>
       </w:r>
       <w:r>
         <w:rPr>
@@ -3725,7 +3660,20 @@
         <w:rPr>
           <w:rStyle w:val="VerbatimChar"/>
         </w:rPr>
-        <w:t xml:space="preserve"> SaaS </w:t>
+        <w:t xml:space="preserve"> / </w:t>
+      </w:r>
+      <w:r>
+        <w:rPr>
+          <w:rStyle w:val="VerbatimChar"/>
+          <w:rFonts w:hint="eastAsia"/>
+        </w:rPr>
+        <w:t xml:space="preserve">本地生活</w:t>
+      </w:r>
+      <w:r>
+        <w:rPr>
+          <w:rStyle w:val="VerbatimChar"/>
+        </w:rPr>
+        <w:t xml:space="preserve"> AI ERP </w:t>
       </w:r>
       <w:r>
         <w:rPr>
@@ -3885,7 +3833,7 @@
         <w:rPr>
           <w:rStyle w:val="VerbatimChar"/>
         </w:rPr>
-        <w:t xml:space="preserve"> Merchant AI Agent + </w:t>
+        <w:t xml:space="preserve"> AI ERP + </w:t>
       </w:r>
       <w:r>
         <w:rPr>
@@ -4456,7 +4404,20 @@
           <w:rStyle w:val="VerbatimChar"/>
           <w:rFonts w:hint="eastAsia"/>
         </w:rPr>
-        <w:t xml:space="preserve">灵祺：星选温州会员</w:t>
+        <w:t xml:space="preserve">灵祺</w:t>
+      </w:r>
+      <w:r>
+        <w:rPr>
+          <w:rStyle w:val="VerbatimChar"/>
+        </w:rPr>
+        <w:t xml:space="preserve"> AI </w:t>
+      </w:r>
+      <w:r>
+        <w:rPr>
+          <w:rStyle w:val="VerbatimChar"/>
+          <w:rFonts w:hint="eastAsia"/>
+        </w:rPr>
+        <w:t xml:space="preserve">ERP：星选温州会员</w:t>
       </w:r>
       <w:r>
         <w:rPr>
@@ -4936,27 +4897,14 @@
         <w:rPr>
           <w:rStyle w:val="VerbatimChar"/>
         </w:rPr>
-        <w:t xml:space="preserve"> AI Agent </w:t>
-      </w:r>
-      <w:r>
-        <w:rPr>
-          <w:rStyle w:val="VerbatimChar"/>
-          <w:rFonts w:hint="eastAsia"/>
-        </w:rPr>
-        <w:t xml:space="preserve">已写入</w:t>
-      </w:r>
-      <w:r>
-        <w:rPr>
-          <w:rStyle w:val="VerbatimChar"/>
-        </w:rPr>
-        <w:t xml:space="preserve"> ERP </w:t>
-      </w:r>
-      <w:r>
-        <w:rPr>
-          <w:rStyle w:val="VerbatimChar"/>
-          <w:rFonts w:hint="eastAsia"/>
-        </w:rPr>
-        <w:t xml:space="preserve">工作流｜宁波墨典</w:t>
+        <w:t xml:space="preserve"> AI ERP </w:t>
+      </w:r>
+      <w:r>
+        <w:rPr>
+          <w:rStyle w:val="VerbatimChar"/>
+          <w:rFonts w:hint="eastAsia"/>
+        </w:rPr>
+        <w:t xml:space="preserve">已写入经营工作流｜宁波墨典</w:t>
       </w:r>
     </w:p>
     <w:p>
@@ -5000,14 +4948,14 @@
         <w:rPr>
           <w:rStyle w:val="VerbatimChar"/>
         </w:rPr>
-        <w:t xml:space="preserve"> Merchant AI Agent </w:t>
-      </w:r>
-      <w:r>
-        <w:rPr>
-          <w:rStyle w:val="VerbatimChar"/>
-          <w:rFonts w:hint="eastAsia"/>
-        </w:rPr>
-        <w:t xml:space="preserve">嵌进商家</w:t>
+        <w:t xml:space="preserve"> AI </w:t>
+      </w:r>
+      <w:r>
+        <w:rPr>
+          <w:rStyle w:val="VerbatimChar"/>
+          <w:rFonts w:hint="eastAsia"/>
+        </w:rPr>
+        <w:t xml:space="preserve">能力嵌进商家</w:t>
       </w:r>
       <w:r>
         <w:rPr>
@@ -5324,7 +5272,7 @@
           <w:rStyle w:val="VerbatimChar"/>
           <w:rFonts w:hint="eastAsia"/>
         </w:rPr>
-        <w:t xml:space="preserve">【BP】灵祺</w:t>
+        <w:t xml:space="preserve">【种子轮】灵祺</w:t>
       </w:r>
       <w:r>
         <w:rPr>
@@ -5337,20 +5285,20 @@
           <w:rStyle w:val="VerbatimChar"/>
           <w:rFonts w:hint="eastAsia"/>
         </w:rPr>
-        <w:t xml:space="preserve">种子轮</w:t>
-      </w:r>
-      <w:r>
-        <w:rPr>
-          <w:rStyle w:val="VerbatimChar"/>
-        </w:rPr>
-        <w:t xml:space="preserve"> · </w:t>
-      </w:r>
-      <w:r>
-        <w:rPr>
-          <w:rStyle w:val="VerbatimChar"/>
-          <w:rFonts w:hint="eastAsia"/>
-        </w:rPr>
-        <w:t xml:space="preserve">本地生活经营编排层，不是有赞插件，也不碰平台资金</w:t>
+        <w:t xml:space="preserve">本地生活</w:t>
+      </w:r>
+      <w:r>
+        <w:rPr>
+          <w:rStyle w:val="VerbatimChar"/>
+        </w:rPr>
+        <w:t xml:space="preserve"> AI </w:t>
+      </w:r>
+      <w:r>
+        <w:rPr>
+          <w:rStyle w:val="VerbatimChar"/>
+          <w:rFonts w:hint="eastAsia"/>
+        </w:rPr>
+        <w:t xml:space="preserve">ERP，不是有赞插件，也不碰平台资金</w:t>
       </w:r>
     </w:p>
     <w:p>
@@ -5727,7 +5675,20 @@
           <w:rStyle w:val="VerbatimChar"/>
           <w:rFonts w:hint="eastAsia"/>
         </w:rPr>
-        <w:t xml:space="preserve">灵祺种子轮：温州已有</w:t>
+        <w:t xml:space="preserve">灵祺</w:t>
+      </w:r>
+      <w:r>
+        <w:rPr>
+          <w:rStyle w:val="VerbatimChar"/>
+        </w:rPr>
+        <w:t xml:space="preserve"> AI ERP </w:t>
+      </w:r>
+      <w:r>
+        <w:rPr>
+          <w:rStyle w:val="VerbatimChar"/>
+          <w:rFonts w:hint="eastAsia"/>
+        </w:rPr>
+        <w:t xml:space="preserve">种子轮：温州已有</w:t>
       </w:r>
       <w:r>
         <w:rPr>

</xml_diff>

<commit_message>
Smooth the Ameba close so it reads as spoken Chinese.
Drop internal jargon about matching GMV and say retention and partner-led store import instead.

Co-authored-by: Cursor <cursoragent@cursor.com>
</commit_message>
<xml_diff>
--- a/docs/seed-round-202609/各机构邮件模板.docx
+++ b/docs/seed-round-202609/各机构邮件模板.docx
@@ -3391,13 +3391,7 @@
           <w:rStyle w:val="VerbatimChar"/>
           <w:rFonts w:hint="eastAsia"/>
         </w:rPr>
-        <w:t xml:space="preserve">ERP｜续费与服务商导入，不是撮合</w:t>
-      </w:r>
-      <w:r>
-        <w:rPr>
-          <w:rStyle w:val="VerbatimChar"/>
-        </w:rPr>
-        <w:t xml:space="preserve"> GMV</w:t>
+        <w:t xml:space="preserve">ERP｜看续费和留存，不是看撮合成交额</w:t>
       </w:r>
     </w:p>
     <w:p>
@@ -3641,7 +3635,7 @@
           <w:rStyle w:val="VerbatimChar"/>
           <w:rFonts w:hint="eastAsia"/>
         </w:rPr>
-        <w:t xml:space="preserve">本轮种子</w:t>
+        <w:t xml:space="preserve">本轮种子目标</w:t>
       </w:r>
       <w:r>
         <w:rPr>
@@ -3654,46 +3648,33 @@
           <w:rStyle w:val="VerbatimChar"/>
           <w:rFonts w:hint="eastAsia"/>
         </w:rPr>
-        <w:t xml:space="preserve">万，希望和您讨论餐饮</w:t>
-      </w:r>
-      <w:r>
-        <w:rPr>
-          <w:rStyle w:val="VerbatimChar"/>
-        </w:rPr>
-        <w:t xml:space="preserve"> / </w:t>
-      </w:r>
-      <w:r>
-        <w:rPr>
-          <w:rStyle w:val="VerbatimChar"/>
-          <w:rFonts w:hint="eastAsia"/>
-        </w:rPr>
-        <w:t xml:space="preserve">本地生活</w:t>
-      </w:r>
-      <w:r>
-        <w:rPr>
-          <w:rStyle w:val="VerbatimChar"/>
-        </w:rPr>
-        <w:t xml:space="preserve"> AI ERP </w:t>
-      </w:r>
-      <w:r>
-        <w:rPr>
-          <w:rStyle w:val="VerbatimChar"/>
-          <w:rFonts w:hint="eastAsia"/>
-        </w:rPr>
-        <w:t xml:space="preserve">的续费、留存和服务商导入，而不是用撮合</w:t>
-      </w:r>
-      <w:r>
-        <w:rPr>
-          <w:rStyle w:val="VerbatimChar"/>
-        </w:rPr>
-        <w:t xml:space="preserve"> GMV </w:t>
-      </w:r>
-      <w:r>
-        <w:rPr>
-          <w:rStyle w:val="VerbatimChar"/>
-          <w:rFonts w:hint="eastAsia"/>
-        </w:rPr>
-        <w:t xml:space="preserve">讲故事。附件为一页纸、备忘录和路演</w:t>
+        <w:t xml:space="preserve">万元。我们想和您讨论的是门店续费、留存，以及服务商怎样把客户带进这套</w:t>
+      </w:r>
+      <w:r>
+        <w:rPr>
+          <w:rStyle w:val="VerbatimChar"/>
+        </w:rPr>
+        <w:t xml:space="preserve"> AI </w:t>
+      </w:r>
+      <w:r>
+        <w:rPr>
+          <w:rStyle w:val="VerbatimChar"/>
+          <w:rFonts w:hint="eastAsia"/>
+        </w:rPr>
+        <w:t xml:space="preserve">ERP；733</w:t>
+      </w:r>
+      <w:r>
+        <w:rPr>
+          <w:rStyle w:val="VerbatimChar"/>
+        </w:rPr>
+        <w:t xml:space="preserve"> </w:t>
+      </w:r>
+      <w:r>
+        <w:rPr>
+          <w:rStyle w:val="VerbatimChar"/>
+          <w:rFonts w:hint="eastAsia"/>
+        </w:rPr>
+        <w:t xml:space="preserve">万是商户成交，不是公司收入。附件为一页纸、备忘录和路演</w:t>
       </w:r>
       <w:r>
         <w:rPr>

</xml_diff>

<commit_message>
Rewrite all seed outreach emails in spoken Chinese.
Remove internal jargon from every institution template so cold mail reads like a founder talking, not a coaching memo.

Co-authored-by: Cursor <cursoragent@cursor.com>
</commit_message>
<xml_diff>
--- a/docs/seed-round-202609/各机构邮件模板.docx
+++ b/docs/seed-round-202609/各机构邮件模板.docx
@@ -279,7 +279,187 @@
           <w:rStyle w:val="VerbatimChar"/>
           <w:rFonts w:hint="eastAsia"/>
         </w:rPr>
-        <w:t xml:space="preserve">经营系统「灵祺」，以及达人履约小程序「灵祺星选」：商户在</w:t>
+        <w:t xml:space="preserve">ERP「灵祺」，以及达人履约小程序「灵祺星选」：商户在系统里组品、发招募，达人报名、交付、回传，数据在同一套系统里。</w:t>
+      </w:r>
+      <w:r>
+        <w:br/>
+      </w:r>
+      <w:r>
+        <w:br/>
+      </w:r>
+      <w:r>
+        <w:rPr>
+          <w:rStyle w:val="VerbatimChar"/>
+          <w:rFonts w:hint="eastAsia"/>
+        </w:rPr>
+        <w:t xml:space="preserve">截至</w:t>
+      </w:r>
+      <w:r>
+        <w:rPr>
+          <w:rStyle w:val="VerbatimChar"/>
+        </w:rPr>
+        <w:t xml:space="preserve"> 2026-09-06 </w:t>
+      </w:r>
+      <w:r>
+        <w:rPr>
+          <w:rStyle w:val="VerbatimChar"/>
+          <w:rFonts w:hint="eastAsia"/>
+        </w:rPr>
+        <w:t xml:space="preserve">生产环境可复核：</w:t>
+      </w:r>
+      <w:r>
+        <w:br/>
+      </w:r>
+      <w:r>
+        <w:rPr>
+          <w:rStyle w:val="VerbatimChar"/>
+        </w:rPr>
+        <w:t xml:space="preserve">· ERP </w:t>
+      </w:r>
+      <w:r>
+        <w:rPr>
+          <w:rStyle w:val="VerbatimChar"/>
+          <w:rFonts w:hint="eastAsia"/>
+        </w:rPr>
+        <w:t xml:space="preserve">租户</w:t>
+      </w:r>
+      <w:r>
+        <w:rPr>
+          <w:rStyle w:val="VerbatimChar"/>
+        </w:rPr>
+        <w:t xml:space="preserve"> </w:t>
+      </w:r>
+      <w:r>
+        <w:rPr>
+          <w:rStyle w:val="VerbatimChar"/>
+          <w:rFonts w:hint="eastAsia"/>
+        </w:rPr>
+        <w:t xml:space="preserve">32（具名主体约</w:t>
+      </w:r>
+      <w:r>
+        <w:rPr>
+          <w:rStyle w:val="VerbatimChar"/>
+        </w:rPr>
+        <w:t xml:space="preserve"> </w:t>
+      </w:r>
+      <w:r>
+        <w:rPr>
+          <w:rStyle w:val="VerbatimChar"/>
+          <w:rFonts w:hint="eastAsia"/>
+        </w:rPr>
+        <w:t xml:space="preserve">14，服务商版</w:t>
+      </w:r>
+      <w:r>
+        <w:rPr>
+          <w:rStyle w:val="VerbatimChar"/>
+        </w:rPr>
+        <w:t xml:space="preserve"> </w:t>
+      </w:r>
+      <w:r>
+        <w:rPr>
+          <w:rStyle w:val="VerbatimChar"/>
+          <w:rFonts w:hint="eastAsia"/>
+        </w:rPr>
+        <w:t xml:space="preserve">5）</w:t>
+      </w:r>
+      <w:r>
+        <w:br/>
+      </w:r>
+      <w:r>
+        <w:rPr>
+          <w:rStyle w:val="VerbatimChar"/>
+        </w:rPr>
+        <w:t xml:space="preserve">· </w:t>
+      </w:r>
+      <w:r>
+        <w:rPr>
+          <w:rStyle w:val="VerbatimChar"/>
+          <w:rFonts w:hint="eastAsia"/>
+        </w:rPr>
+        <w:t xml:space="preserve">星选会员</w:t>
+      </w:r>
+      <w:r>
+        <w:rPr>
+          <w:rStyle w:val="VerbatimChar"/>
+        </w:rPr>
+        <w:t xml:space="preserve"> </w:t>
+      </w:r>
+      <w:r>
+        <w:rPr>
+          <w:rStyle w:val="VerbatimChar"/>
+          <w:rFonts w:hint="eastAsia"/>
+        </w:rPr>
+        <w:t xml:space="preserve">737，其中温州</w:t>
+      </w:r>
+      <w:r>
+        <w:rPr>
+          <w:rStyle w:val="VerbatimChar"/>
+        </w:rPr>
+        <w:t xml:space="preserve"> </w:t>
+      </w:r>
+      <w:r>
+        <w:rPr>
+          <w:rStyle w:val="VerbatimChar"/>
+          <w:rFonts w:hint="eastAsia"/>
+        </w:rPr>
+        <w:t xml:space="preserve">264、浙江</w:t>
+      </w:r>
+      <w:r>
+        <w:rPr>
+          <w:rStyle w:val="VerbatimChar"/>
+        </w:rPr>
+        <w:t xml:space="preserve"> 424</w:t>
+      </w:r>
+      <w:r>
+        <w:br/>
+      </w:r>
+      <w:r>
+        <w:rPr>
+          <w:rStyle w:val="VerbatimChar"/>
+        </w:rPr>
+        <w:t xml:space="preserve">· </w:t>
+      </w:r>
+      <w:r>
+        <w:rPr>
+          <w:rStyle w:val="VerbatimChar"/>
+          <w:rFonts w:hint="eastAsia"/>
+        </w:rPr>
+        <w:t xml:space="preserve">招募单</w:t>
+      </w:r>
+      <w:r>
+        <w:rPr>
+          <w:rStyle w:val="VerbatimChar"/>
+        </w:rPr>
+        <w:t xml:space="preserve"> </w:t>
+      </w:r>
+      <w:r>
+        <w:rPr>
+          <w:rStyle w:val="VerbatimChar"/>
+          <w:rFonts w:hint="eastAsia"/>
+        </w:rPr>
+        <w:t xml:space="preserve">293，累计报名</w:t>
+      </w:r>
+      <w:r>
+        <w:rPr>
+          <w:rStyle w:val="VerbatimChar"/>
+        </w:rPr>
+        <w:t xml:space="preserve"> 1,979</w:t>
+      </w:r>
+      <w:r>
+        <w:br/>
+      </w:r>
+      <w:r>
+        <w:rPr>
+          <w:rStyle w:val="VerbatimChar"/>
+        </w:rPr>
+        <w:t xml:space="preserve">· 3 </w:t>
+      </w:r>
+      <w:r>
+        <w:rPr>
+          <w:rStyle w:val="VerbatimChar"/>
+          <w:rFonts w:hint="eastAsia"/>
+        </w:rPr>
+        <w:t xml:space="preserve">家深度店已向</w:t>
       </w:r>
       <w:r>
         <w:rPr>
@@ -292,88 +472,33 @@
           <w:rStyle w:val="VerbatimChar"/>
           <w:rFonts w:hint="eastAsia"/>
         </w:rPr>
-        <w:t xml:space="preserve">里组品、发招募，达人报名、交付、回链，数据同一套注册表。</w:t>
-      </w:r>
-      <w:r>
-        <w:br/>
-      </w:r>
-      <w:r>
-        <w:br/>
-      </w:r>
-      <w:r>
-        <w:rPr>
-          <w:rStyle w:val="VerbatimChar"/>
-          <w:rFonts w:hint="eastAsia"/>
-        </w:rPr>
-        <w:t xml:space="preserve">截至</w:t>
-      </w:r>
-      <w:r>
-        <w:rPr>
-          <w:rStyle w:val="VerbatimChar"/>
-        </w:rPr>
-        <w:t xml:space="preserve"> 2026-09-06 </w:t>
-      </w:r>
-      <w:r>
-        <w:rPr>
-          <w:rStyle w:val="VerbatimChar"/>
-          <w:rFonts w:hint="eastAsia"/>
-        </w:rPr>
-        <w:t xml:space="preserve">生产环境可复核：</w:t>
-      </w:r>
-      <w:r>
-        <w:br/>
-      </w:r>
-      <w:r>
-        <w:rPr>
-          <w:rStyle w:val="VerbatimChar"/>
-        </w:rPr>
-        <w:t xml:space="preserve">· ERP </w:t>
-      </w:r>
-      <w:r>
-        <w:rPr>
-          <w:rStyle w:val="VerbatimChar"/>
-          <w:rFonts w:hint="eastAsia"/>
-        </w:rPr>
-        <w:t xml:space="preserve">租户</w:t>
-      </w:r>
-      <w:r>
-        <w:rPr>
-          <w:rStyle w:val="VerbatimChar"/>
-        </w:rPr>
-        <w:t xml:space="preserve"> </w:t>
-      </w:r>
-      <w:r>
-        <w:rPr>
-          <w:rStyle w:val="VerbatimChar"/>
-          <w:rFonts w:hint="eastAsia"/>
-        </w:rPr>
-        <w:t xml:space="preserve">32（具名主体约</w:t>
-      </w:r>
-      <w:r>
-        <w:rPr>
-          <w:rStyle w:val="VerbatimChar"/>
-        </w:rPr>
-        <w:t xml:space="preserve"> </w:t>
-      </w:r>
-      <w:r>
-        <w:rPr>
-          <w:rStyle w:val="VerbatimChar"/>
-          <w:rFonts w:hint="eastAsia"/>
-        </w:rPr>
-        <w:t xml:space="preserve">14，服务商版</w:t>
-      </w:r>
-      <w:r>
-        <w:rPr>
-          <w:rStyle w:val="VerbatimChar"/>
-        </w:rPr>
-        <w:t xml:space="preserve"> </w:t>
-      </w:r>
-      <w:r>
-        <w:rPr>
-          <w:rStyle w:val="VerbatimChar"/>
-          <w:rFonts w:hint="eastAsia"/>
-        </w:rPr>
-        <w:t xml:space="preserve">5）</w:t>
+        <w:t xml:space="preserve">同步抖音来客订单</w:t>
+      </w:r>
+      <w:r>
+        <w:rPr>
+          <w:rStyle w:val="VerbatimChar"/>
+        </w:rPr>
+        <w:t xml:space="preserve"> 59,643 </w:t>
+      </w:r>
+      <w:r>
+        <w:rPr>
+          <w:rStyle w:val="VerbatimChar"/>
+          <w:rFonts w:hint="eastAsia"/>
+        </w:rPr>
+        <w:t xml:space="preserve">单、平台成交</w:t>
+      </w:r>
+      <w:r>
+        <w:rPr>
+          <w:rStyle w:val="VerbatimChar"/>
+        </w:rPr>
+        <w:t xml:space="preserve"> 733 </w:t>
+      </w:r>
+      <w:r>
+        <w:rPr>
+          <w:rStyle w:val="VerbatimChar"/>
+          <w:rFonts w:hint="eastAsia"/>
+        </w:rPr>
+        <w:t xml:space="preserve">万（商户成交，不是公司收入）</w:t>
       </w:r>
       <w:r>
         <w:br/>
@@ -389,144 +514,6 @@
           <w:rStyle w:val="VerbatimChar"/>
           <w:rFonts w:hint="eastAsia"/>
         </w:rPr>
-        <w:t xml:space="preserve">星选会员</w:t>
-      </w:r>
-      <w:r>
-        <w:rPr>
-          <w:rStyle w:val="VerbatimChar"/>
-        </w:rPr>
-        <w:t xml:space="preserve"> </w:t>
-      </w:r>
-      <w:r>
-        <w:rPr>
-          <w:rStyle w:val="VerbatimChar"/>
-          <w:rFonts w:hint="eastAsia"/>
-        </w:rPr>
-        <w:t xml:space="preserve">737，其中温州</w:t>
-      </w:r>
-      <w:r>
-        <w:rPr>
-          <w:rStyle w:val="VerbatimChar"/>
-        </w:rPr>
-        <w:t xml:space="preserve"> </w:t>
-      </w:r>
-      <w:r>
-        <w:rPr>
-          <w:rStyle w:val="VerbatimChar"/>
-          <w:rFonts w:hint="eastAsia"/>
-        </w:rPr>
-        <w:t xml:space="preserve">264、浙江</w:t>
-      </w:r>
-      <w:r>
-        <w:rPr>
-          <w:rStyle w:val="VerbatimChar"/>
-        </w:rPr>
-        <w:t xml:space="preserve"> 424</w:t>
-      </w:r>
-      <w:r>
-        <w:br/>
-      </w:r>
-      <w:r>
-        <w:rPr>
-          <w:rStyle w:val="VerbatimChar"/>
-        </w:rPr>
-        <w:t xml:space="preserve">· </w:t>
-      </w:r>
-      <w:r>
-        <w:rPr>
-          <w:rStyle w:val="VerbatimChar"/>
-          <w:rFonts w:hint="eastAsia"/>
-        </w:rPr>
-        <w:t xml:space="preserve">招募单</w:t>
-      </w:r>
-      <w:r>
-        <w:rPr>
-          <w:rStyle w:val="VerbatimChar"/>
-        </w:rPr>
-        <w:t xml:space="preserve"> </w:t>
-      </w:r>
-      <w:r>
-        <w:rPr>
-          <w:rStyle w:val="VerbatimChar"/>
-          <w:rFonts w:hint="eastAsia"/>
-        </w:rPr>
-        <w:t xml:space="preserve">293，累计报名</w:t>
-      </w:r>
-      <w:r>
-        <w:rPr>
-          <w:rStyle w:val="VerbatimChar"/>
-        </w:rPr>
-        <w:t xml:space="preserve"> 1,979</w:t>
-      </w:r>
-      <w:r>
-        <w:br/>
-      </w:r>
-      <w:r>
-        <w:rPr>
-          <w:rStyle w:val="VerbatimChar"/>
-        </w:rPr>
-        <w:t xml:space="preserve">· 3 </w:t>
-      </w:r>
-      <w:r>
-        <w:rPr>
-          <w:rStyle w:val="VerbatimChar"/>
-          <w:rFonts w:hint="eastAsia"/>
-        </w:rPr>
-        <w:t xml:space="preserve">家深度店已向</w:t>
-      </w:r>
-      <w:r>
-        <w:rPr>
-          <w:rStyle w:val="VerbatimChar"/>
-        </w:rPr>
-        <w:t xml:space="preserve"> ERP </w:t>
-      </w:r>
-      <w:r>
-        <w:rPr>
-          <w:rStyle w:val="VerbatimChar"/>
-          <w:rFonts w:hint="eastAsia"/>
-        </w:rPr>
-        <w:t xml:space="preserve">同步抖音来客订单</w:t>
-      </w:r>
-      <w:r>
-        <w:rPr>
-          <w:rStyle w:val="VerbatimChar"/>
-        </w:rPr>
-        <w:t xml:space="preserve"> 59,643 </w:t>
-      </w:r>
-      <w:r>
-        <w:rPr>
-          <w:rStyle w:val="VerbatimChar"/>
-          <w:rFonts w:hint="eastAsia"/>
-        </w:rPr>
-        <w:t xml:space="preserve">单、平台</w:t>
-      </w:r>
-      <w:r>
-        <w:rPr>
-          <w:rStyle w:val="VerbatimChar"/>
-        </w:rPr>
-        <w:t xml:space="preserve"> GMV 733 </w:t>
-      </w:r>
-      <w:r>
-        <w:rPr>
-          <w:rStyle w:val="VerbatimChar"/>
-          <w:rFonts w:hint="eastAsia"/>
-        </w:rPr>
-        <w:t xml:space="preserve">万（商户成交，不是公司收入）</w:t>
-      </w:r>
-      <w:r>
-        <w:br/>
-      </w:r>
-      <w:r>
-        <w:rPr>
-          <w:rStyle w:val="VerbatimChar"/>
-        </w:rPr>
-        <w:t xml:space="preserve">· </w:t>
-      </w:r>
-      <w:r>
-        <w:rPr>
-          <w:rStyle w:val="VerbatimChar"/>
-          <w:rFonts w:hint="eastAsia"/>
-        </w:rPr>
         <w:t xml:space="preserve">支付通道已通，确认到账约</w:t>
       </w:r>
       <w:r>
@@ -540,7 +527,7 @@
           <w:rStyle w:val="VerbatimChar"/>
           <w:rFonts w:hint="eastAsia"/>
         </w:rPr>
-        <w:t xml:space="preserve">万，本轮重点是把用量转为经常性收入</w:t>
+        <w:t xml:space="preserve">万，本轮重点是把现有用量做成经常性收入</w:t>
       </w:r>
       <w:r>
         <w:br/>
@@ -566,7 +553,7 @@
           <w:rStyle w:val="VerbatimChar"/>
           <w:rFonts w:hint="eastAsia"/>
         </w:rPr>
-        <w:t xml:space="preserve">万元，希望申请贵基金种子直投，把数字化工具留在宁波主体、服务杭甬温商户与达人。</w:t>
+        <w:t xml:space="preserve">万元，希望申请贵基金种子直投，服务杭甬温的商户和达人。</w:t>
       </w:r>
       <w:r>
         <w:br/>
@@ -605,33 +592,7 @@
           <w:rStyle w:val="VerbatimChar"/>
           <w:rFonts w:hint="eastAsia"/>
         </w:rPr>
-        <w:t xml:space="preserve">分钟演示「ERP</w:t>
-      </w:r>
-      <w:r>
-        <w:rPr>
-          <w:rStyle w:val="VerbatimChar"/>
-        </w:rPr>
-        <w:t xml:space="preserve"> </w:t>
-      </w:r>
-      <w:r>
-        <w:rPr>
-          <w:rStyle w:val="VerbatimChar"/>
-          <w:rFonts w:hint="eastAsia"/>
-        </w:rPr>
-        <w:t xml:space="preserve">发单</w:t>
-      </w:r>
-      <w:r>
-        <w:rPr>
-          <w:rStyle w:val="VerbatimChar"/>
-        </w:rPr>
-        <w:t xml:space="preserve"> → </w:t>
-      </w:r>
-      <w:r>
-        <w:rPr>
-          <w:rStyle w:val="VerbatimChar"/>
-          <w:rFonts w:hint="eastAsia"/>
-        </w:rPr>
-        <w:t xml:space="preserve">星选报名」。</w:t>
+        <w:t xml:space="preserve">分钟演示商家发单、达人报名。</w:t>
       </w:r>
       <w:r>
         <w:br/>
@@ -840,7 +801,7 @@
           <w:rStyle w:val="VerbatimChar"/>
           <w:rFonts w:hint="eastAsia"/>
         </w:rPr>
-        <w:t xml:space="preserve">我们做的是嵌进本地生活工作流的</w:t>
+        <w:t xml:space="preserve">我们做本地生活</w:t>
       </w:r>
       <w:r>
         <w:rPr>
@@ -866,20 +827,7 @@
           <w:rStyle w:val="VerbatimChar"/>
           <w:rFonts w:hint="eastAsia"/>
         </w:rPr>
-        <w:t xml:space="preserve">给出组品、Brief、店铺分析和短视频方案，商户预览确认后再写入系统；达人侧用「灵祺星选」完成招募、报名、探店</w:t>
-      </w:r>
-      <w:r>
-        <w:rPr>
-          <w:rStyle w:val="VerbatimChar"/>
-        </w:rPr>
-        <w:t xml:space="preserve"> / </w:t>
-      </w:r>
-      <w:r>
-        <w:rPr>
-          <w:rStyle w:val="VerbatimChar"/>
-          <w:rFonts w:hint="eastAsia"/>
-        </w:rPr>
-        <w:t xml:space="preserve">云剪和回链核查。</w:t>
+        <w:t xml:space="preserve">给出组品、方案、店铺分析和短视频，商户确认后再写入系统；达人用「灵祺星选」报名、探店或云剪，并回传结果。</w:t>
       </w:r>
       <w:r>
         <w:br/>
@@ -1066,13 +1014,13 @@
           <w:rStyle w:val="VerbatimChar"/>
           <w:rFonts w:hint="eastAsia"/>
         </w:rPr>
-        <w:t xml:space="preserve">单、平台</w:t>
-      </w:r>
-      <w:r>
-        <w:rPr>
-          <w:rStyle w:val="VerbatimChar"/>
-        </w:rPr>
-        <w:t xml:space="preserve"> GMV 733 </w:t>
+        <w:t xml:space="preserve">单、平台成交</w:t>
+      </w:r>
+      <w:r>
+        <w:rPr>
+          <w:rStyle w:val="VerbatimChar"/>
+        </w:rPr>
+        <w:t xml:space="preserve"> 733 </w:t>
       </w:r>
       <w:r>
         <w:rPr>
@@ -1108,61 +1056,35 @@
           <w:rStyle w:val="VerbatimChar"/>
           <w:rFonts w:hint="eastAsia"/>
         </w:rPr>
+        <w:t xml:space="preserve">次，7</w:t>
+      </w:r>
+      <w:r>
+        <w:rPr>
+          <w:rStyle w:val="VerbatimChar"/>
+        </w:rPr>
+        <w:t xml:space="preserve"> </w:t>
+      </w:r>
+      <w:r>
+        <w:rPr>
+          <w:rStyle w:val="VerbatimChar"/>
+          <w:rFonts w:hint="eastAsia"/>
+        </w:rPr>
+        <w:t xml:space="preserve">月高峰</w:t>
+      </w:r>
+      <w:r>
+        <w:rPr>
+          <w:rStyle w:val="VerbatimChar"/>
+        </w:rPr>
+        <w:t xml:space="preserve"> 4,286 </w:t>
+      </w:r>
+      <w:r>
+        <w:rPr>
+          <w:rStyle w:val="VerbatimChar"/>
+          <w:rFonts w:hint="eastAsia"/>
+        </w:rPr>
         <w:t xml:space="preserve">次</w:t>
       </w:r>
       <w:r>
-        <w:rPr>
-          <w:rStyle w:val="VerbatimChar"/>
-        </w:rPr>
-        <w:t xml:space="preserve"> / 1,224 </w:t>
-      </w:r>
-      <w:r>
-        <w:rPr>
-          <w:rStyle w:val="VerbatimChar"/>
-          <w:rFonts w:hint="eastAsia"/>
-        </w:rPr>
-        <w:t xml:space="preserve">万</w:t>
-      </w:r>
-      <w:r>
-        <w:rPr>
-          <w:rStyle w:val="VerbatimChar"/>
-        </w:rPr>
-        <w:t xml:space="preserve"> </w:t>
-      </w:r>
-      <w:r>
-        <w:rPr>
-          <w:rStyle w:val="VerbatimChar"/>
-          <w:rFonts w:hint="eastAsia"/>
-        </w:rPr>
-        <w:t xml:space="preserve">Token，7</w:t>
-      </w:r>
-      <w:r>
-        <w:rPr>
-          <w:rStyle w:val="VerbatimChar"/>
-        </w:rPr>
-        <w:t xml:space="preserve"> </w:t>
-      </w:r>
-      <w:r>
-        <w:rPr>
-          <w:rStyle w:val="VerbatimChar"/>
-          <w:rFonts w:hint="eastAsia"/>
-        </w:rPr>
-        <w:t xml:space="preserve">月高峰</w:t>
-      </w:r>
-      <w:r>
-        <w:rPr>
-          <w:rStyle w:val="VerbatimChar"/>
-        </w:rPr>
-        <w:t xml:space="preserve"> 4,286 </w:t>
-      </w:r>
-      <w:r>
-        <w:rPr>
-          <w:rStyle w:val="VerbatimChar"/>
-          <w:rFonts w:hint="eastAsia"/>
-        </w:rPr>
-        <w:t xml:space="preserve">次</w:t>
-      </w:r>
-      <w:r>
         <w:br/>
       </w:r>
       <w:r>
@@ -1189,7 +1111,7 @@
           <w:rStyle w:val="VerbatimChar"/>
           <w:rFonts w:hint="eastAsia"/>
         </w:rPr>
-        <w:t xml:space="preserve">万，规模化收费是本轮要解决的问题</w:t>
+        <w:t xml:space="preserve">万，规模化收费还没起来，这是本轮要解决的问题</w:t>
       </w:r>
       <w:r>
         <w:br/>
@@ -1215,20 +1137,20 @@
           <w:rStyle w:val="VerbatimChar"/>
           <w:rFonts w:hint="eastAsia"/>
         </w:rPr>
-        <w:t xml:space="preserve">万，战场只在杭甬温。官网申请表已同步提交。附件为一页纸、备忘录和路演</w:t>
-      </w:r>
-      <w:r>
-        <w:rPr>
-          <w:rStyle w:val="VerbatimChar"/>
-        </w:rPr>
-        <w:t xml:space="preserve"> </w:t>
-      </w:r>
-      <w:r>
-        <w:rPr>
-          <w:rStyle w:val="VerbatimChar"/>
-          <w:rFonts w:hint="eastAsia"/>
-        </w:rPr>
-        <w:t xml:space="preserve">PDF，方便时想演示主链路。</w:t>
+        <w:t xml:space="preserve">万元，只做杭甬温。官网申请表已同步提交。附件为一页纸、备忘录和路演</w:t>
+      </w:r>
+      <w:r>
+        <w:rPr>
+          <w:rStyle w:val="VerbatimChar"/>
+        </w:rPr>
+        <w:t xml:space="preserve"> </w:t>
+      </w:r>
+      <w:r>
+        <w:rPr>
+          <w:rStyle w:val="VerbatimChar"/>
+          <w:rFonts w:hint="eastAsia"/>
+        </w:rPr>
+        <w:t xml:space="preserve">PDF。方便时想演示商家发单、达人报名。</w:t>
       </w:r>
       <w:r>
         <w:br/>
@@ -1434,7 +1356,7 @@
           <w:rStyle w:val="VerbatimChar"/>
           <w:rFonts w:hint="eastAsia"/>
         </w:rPr>
-        <w:t xml:space="preserve">我们服务浙江本地生活门店：左边是商家</w:t>
+        <w:t xml:space="preserve">我们服务浙江本地生活门店：一边是商家</w:t>
       </w:r>
       <w:r>
         <w:rPr>
@@ -1460,7 +1382,7 @@
           <w:rStyle w:val="VerbatimChar"/>
           <w:rFonts w:hint="eastAsia"/>
         </w:rPr>
-        <w:t xml:space="preserve">ERP，右边是星选达人履约网。宁波做灰测和主体落地，温州已有达人供给密度。</w:t>
+        <w:t xml:space="preserve">ERP，一边是星选达人履约。公司在宁波，温州已经有一批达人。</w:t>
       </w:r>
       <w:r>
         <w:br/>
@@ -1624,13 +1546,13 @@
           <w:rStyle w:val="VerbatimChar"/>
           <w:rFonts w:hint="eastAsia"/>
         </w:rPr>
-        <w:t xml:space="preserve">单、平台</w:t>
-      </w:r>
-      <w:r>
-        <w:rPr>
-          <w:rStyle w:val="VerbatimChar"/>
-        </w:rPr>
-        <w:t xml:space="preserve"> GMV 733 </w:t>
+        <w:t xml:space="preserve">单、平台成交</w:t>
+      </w:r>
+      <w:r>
+        <w:rPr>
+          <w:rStyle w:val="VerbatimChar"/>
+        </w:rPr>
+        <w:t xml:space="preserve"> 733 </w:t>
       </w:r>
       <w:r>
         <w:rPr>
@@ -1666,7 +1588,7 @@
           <w:rStyle w:val="VerbatimChar"/>
           <w:rFonts w:hint="eastAsia"/>
         </w:rPr>
-        <w:t xml:space="preserve">万，本轮要把「能用」做成「能收费」</w:t>
+        <w:t xml:space="preserve">万，本轮要把已经在用的系统做成能收费</w:t>
       </w:r>
       <w:r>
         <w:br/>
@@ -1692,7 +1614,7 @@
           <w:rStyle w:val="VerbatimChar"/>
           <w:rFonts w:hint="eastAsia"/>
         </w:rPr>
-        <w:t xml:space="preserve">万，首次交割</w:t>
+        <w:t xml:space="preserve">万元，首次交割</w:t>
       </w:r>
       <w:r>
         <w:rPr>
@@ -1705,20 +1627,7 @@
           <w:rStyle w:val="VerbatimChar"/>
           <w:rFonts w:hint="eastAsia"/>
         </w:rPr>
-        <w:t xml:space="preserve">万即可启动，只做杭甬温，不讲全国</w:t>
-      </w:r>
-      <w:r>
-        <w:rPr>
-          <w:rStyle w:val="VerbatimChar"/>
-        </w:rPr>
-        <w:t xml:space="preserve"> 2 </w:t>
-      </w:r>
-      <w:r>
-        <w:rPr>
-          <w:rStyle w:val="VerbatimChar"/>
-          <w:rFonts w:hint="eastAsia"/>
-        </w:rPr>
-        <w:t xml:space="preserve">万店。已在贵机构八问提交，附件为一页纸、备忘录和路演</w:t>
+        <w:t xml:space="preserve">万即可启动，只做杭甬温。已在贵机构八问提交。附件为一页纸、备忘录和路演</w:t>
       </w:r>
       <w:r>
         <w:rPr>
@@ -1933,20 +1842,7 @@
           <w:rStyle w:val="VerbatimChar"/>
           <w:rFonts w:hint="eastAsia"/>
         </w:rPr>
-        <w:t xml:space="preserve">灵祺做的是浙江本地生活商户的经营操作系统：商家在</w:t>
-      </w:r>
-      <w:r>
-        <w:rPr>
-          <w:rStyle w:val="VerbatimChar"/>
-        </w:rPr>
-        <w:t xml:space="preserve"> ERP </w:t>
-      </w:r>
-      <w:r>
-        <w:rPr>
-          <w:rStyle w:val="VerbatimChar"/>
-          <w:rFonts w:hint="eastAsia"/>
-        </w:rPr>
-        <w:t xml:space="preserve">里用</w:t>
+        <w:t xml:space="preserve">灵祺是浙江本地生活商户的</w:t>
       </w:r>
       <w:r>
         <w:rPr>
@@ -1959,7 +1855,20 @@
           <w:rStyle w:val="VerbatimChar"/>
           <w:rFonts w:hint="eastAsia"/>
         </w:rPr>
-        <w:t xml:space="preserve">组品、发招募，达人在星选小程序履约回链。主体在宁波，供给密度在温州，后续复制看杭州。</w:t>
+        <w:t xml:space="preserve">ERP：商家在系统里用</w:t>
+      </w:r>
+      <w:r>
+        <w:rPr>
+          <w:rStyle w:val="VerbatimChar"/>
+        </w:rPr>
+        <w:t xml:space="preserve"> AI </w:t>
+      </w:r>
+      <w:r>
+        <w:rPr>
+          <w:rStyle w:val="VerbatimChar"/>
+          <w:rFonts w:hint="eastAsia"/>
+        </w:rPr>
+        <w:t xml:space="preserve">组品、发招募，达人在星选小程序完成履约并回传。公司在宁波，达人主要在温州，下一步看杭州。</w:t>
       </w:r>
       <w:r>
         <w:br/>
@@ -2159,13 +2068,13 @@
           <w:rStyle w:val="VerbatimChar"/>
           <w:rFonts w:hint="eastAsia"/>
         </w:rPr>
-        <w:t xml:space="preserve">单、平台</w:t>
-      </w:r>
-      <w:r>
-        <w:rPr>
-          <w:rStyle w:val="VerbatimChar"/>
-        </w:rPr>
-        <w:t xml:space="preserve"> GMV 733 </w:t>
+        <w:t xml:space="preserve">单、平台成交</w:t>
+      </w:r>
+      <w:r>
+        <w:rPr>
+          <w:rStyle w:val="VerbatimChar"/>
+        </w:rPr>
+        <w:t xml:space="preserve"> 733 </w:t>
       </w:r>
       <w:r>
         <w:rPr>
@@ -2201,33 +2110,7 @@
           <w:rStyle w:val="VerbatimChar"/>
           <w:rFonts w:hint="eastAsia"/>
         </w:rPr>
-        <w:t xml:space="preserve">万，本轮用于把用量做成可审计的订阅</w:t>
-      </w:r>
-      <w:r>
-        <w:rPr>
-          <w:rStyle w:val="VerbatimChar"/>
-        </w:rPr>
-        <w:t xml:space="preserve"> + </w:t>
-      </w:r>
-      <w:r>
-        <w:rPr>
-          <w:rStyle w:val="VerbatimChar"/>
-          <w:rFonts w:hint="eastAsia"/>
-        </w:rPr>
-        <w:t xml:space="preserve">履约</w:t>
-      </w:r>
-      <w:r>
-        <w:rPr>
-          <w:rStyle w:val="VerbatimChar"/>
-        </w:rPr>
-        <w:t xml:space="preserve"> + </w:t>
-      </w:r>
-      <w:r>
-        <w:rPr>
-          <w:rStyle w:val="VerbatimChar"/>
-          <w:rFonts w:hint="eastAsia"/>
-        </w:rPr>
-        <w:t xml:space="preserve">服务商导入</w:t>
+        <w:t xml:space="preserve">万，本轮要把现有用量做成门店订阅和履约收费</w:t>
       </w:r>
       <w:r>
         <w:br/>
@@ -2266,7 +2149,7 @@
           <w:rStyle w:val="VerbatimChar"/>
           <w:rFonts w:hint="eastAsia"/>
         </w:rPr>
-        <w:t xml:space="preserve">万，跑道</w:t>
+        <w:t xml:space="preserve">万，计划用</w:t>
       </w:r>
       <w:r>
         <w:rPr>
@@ -2279,7 +2162,7 @@
           <w:rStyle w:val="VerbatimChar"/>
           <w:rFonts w:hint="eastAsia"/>
         </w:rPr>
-        <w:t xml:space="preserve">个月。希望与贵机构讨论浙江实体经济数字化的区域密度模型，而不是全国铺开。</w:t>
+        <w:t xml:space="preserve">个月。希望先把杭甬温做深，而不是全国铺开。</w:t>
       </w:r>
       <w:r>
         <w:br/>
@@ -2318,7 +2201,7 @@
           <w:rStyle w:val="VerbatimChar"/>
           <w:rFonts w:hint="eastAsia"/>
         </w:rPr>
-        <w:t xml:space="preserve">分钟演示主链路。</w:t>
+        <w:t xml:space="preserve">分钟演示商家发单、达人报名。</w:t>
       </w:r>
       <w:r>
         <w:br/>
@@ -2497,33 +2380,20 @@
           <w:rStyle w:val="VerbatimChar"/>
           <w:rFonts w:hint="eastAsia"/>
         </w:rPr>
-        <w:t xml:space="preserve">本地生活门店缺的不是平台，是一套会经营、能找达人、交得出、结得清的系统。灵祺把</w:t>
-      </w:r>
-      <w:r>
-        <w:rPr>
-          <w:rStyle w:val="VerbatimChar"/>
-        </w:rPr>
-        <w:t xml:space="preserve"> AI </w:t>
-      </w:r>
-      <w:r>
-        <w:rPr>
-          <w:rStyle w:val="VerbatimChar"/>
-          <w:rFonts w:hint="eastAsia"/>
-        </w:rPr>
-        <w:t xml:space="preserve">商家</w:t>
-      </w:r>
-      <w:r>
-        <w:rPr>
-          <w:rStyle w:val="VerbatimChar"/>
-        </w:rPr>
-        <w:t xml:space="preserve"> ERP </w:t>
-      </w:r>
-      <w:r>
-        <w:rPr>
-          <w:rStyle w:val="VerbatimChar"/>
-          <w:rFonts w:hint="eastAsia"/>
-        </w:rPr>
-        <w:t xml:space="preserve">和星选履约网做成同一条流水线。</w:t>
+        <w:t xml:space="preserve">本地生活门店缺的不是平台，是一套能经营、能找达人、能交付、能结算的系统。灵祺把</w:t>
+      </w:r>
+      <w:r>
+        <w:rPr>
+          <w:rStyle w:val="VerbatimChar"/>
+        </w:rPr>
+        <w:t xml:space="preserve"> AI ERP </w:t>
+      </w:r>
+      <w:r>
+        <w:rPr>
+          <w:rStyle w:val="VerbatimChar"/>
+          <w:rFonts w:hint="eastAsia"/>
+        </w:rPr>
+        <w:t xml:space="preserve">和星选履约做成同一条线。</w:t>
       </w:r>
       <w:r>
         <w:br/>
@@ -2613,20 +2483,20 @@
           <w:rStyle w:val="VerbatimChar"/>
           <w:rFonts w:hint="eastAsia"/>
         </w:rPr>
-        <w:t xml:space="preserve">月供给起来后，8</w:t>
-      </w:r>
-      <w:r>
-        <w:rPr>
-          <w:rStyle w:val="VerbatimChar"/>
-        </w:rPr>
-        <w:t xml:space="preserve"> </w:t>
-      </w:r>
-      <w:r>
-        <w:rPr>
-          <w:rStyle w:val="VerbatimChar"/>
-          <w:rFonts w:hint="eastAsia"/>
-        </w:rPr>
-        <w:t xml:space="preserve">月我们主动收供给、转质量，不靠烧钱铺人</w:t>
+        <w:t xml:space="preserve">月达人增加较快，8</w:t>
+      </w:r>
+      <w:r>
+        <w:rPr>
+          <w:rStyle w:val="VerbatimChar"/>
+        </w:rPr>
+        <w:t xml:space="preserve"> </w:t>
+      </w:r>
+      <w:r>
+        <w:rPr>
+          <w:rStyle w:val="VerbatimChar"/>
+          <w:rFonts w:hint="eastAsia"/>
+        </w:rPr>
+        <w:t xml:space="preserve">月起我们放慢加人，先把供给做扎实</w:t>
       </w:r>
       <w:r>
         <w:br/>
@@ -2655,7 +2525,7 @@
           <w:rStyle w:val="VerbatimChar"/>
           <w:rFonts w:hint="eastAsia"/>
         </w:rPr>
-        <w:t xml:space="preserve">单抖音订单灌进</w:t>
+        <w:t xml:space="preserve">单抖音订单同步进</w:t>
       </w:r>
       <w:r>
         <w:rPr>
@@ -2710,20 +2580,20 @@
           <w:rStyle w:val="VerbatimChar"/>
           <w:rFonts w:hint="eastAsia"/>
         </w:rPr>
-        <w:t xml:space="preserve">万，这是本轮要补上的缺口</w:t>
-      </w:r>
-      <w:r>
-        <w:br/>
-      </w:r>
-      <w:r>
-        <w:br/>
-      </w:r>
-      <w:r>
-        <w:rPr>
-          <w:rStyle w:val="VerbatimChar"/>
-          <w:rFonts w:hint="eastAsia"/>
-        </w:rPr>
-        <w:t xml:space="preserve">本轮种子</w:t>
+        <w:t xml:space="preserve">万，本轮就是要把收费做起来</w:t>
+      </w:r>
+      <w:r>
+        <w:br/>
+      </w:r>
+      <w:r>
+        <w:br/>
+      </w:r>
+      <w:r>
+        <w:rPr>
+          <w:rStyle w:val="VerbatimChar"/>
+          <w:rFonts w:hint="eastAsia"/>
+        </w:rPr>
+        <w:t xml:space="preserve">本轮种子目标</w:t>
       </w:r>
       <w:r>
         <w:rPr>
@@ -2736,46 +2606,20 @@
           <w:rStyle w:val="VerbatimChar"/>
           <w:rFonts w:hint="eastAsia"/>
         </w:rPr>
-        <w:t xml:space="preserve">万，只做杭甬温。附件为一页纸、备忘录和路演</w:t>
-      </w:r>
-      <w:r>
-        <w:rPr>
-          <w:rStyle w:val="VerbatimChar"/>
-        </w:rPr>
-        <w:t xml:space="preserve"> </w:t>
-      </w:r>
-      <w:r>
-        <w:rPr>
-          <w:rStyle w:val="VerbatimChar"/>
-          <w:rFonts w:hint="eastAsia"/>
-        </w:rPr>
-        <w:t xml:space="preserve">PDF，方便时想演示「ERP</w:t>
-      </w:r>
-      <w:r>
-        <w:rPr>
-          <w:rStyle w:val="VerbatimChar"/>
-        </w:rPr>
-        <w:t xml:space="preserve"> </w:t>
-      </w:r>
-      <w:r>
-        <w:rPr>
-          <w:rStyle w:val="VerbatimChar"/>
-          <w:rFonts w:hint="eastAsia"/>
-        </w:rPr>
-        <w:t xml:space="preserve">发单</w:t>
-      </w:r>
-      <w:r>
-        <w:rPr>
-          <w:rStyle w:val="VerbatimChar"/>
-        </w:rPr>
-        <w:t xml:space="preserve"> → </w:t>
-      </w:r>
-      <w:r>
-        <w:rPr>
-          <w:rStyle w:val="VerbatimChar"/>
-          <w:rFonts w:hint="eastAsia"/>
-        </w:rPr>
-        <w:t xml:space="preserve">星选报名」。</w:t>
+        <w:t xml:space="preserve">万元，只做杭甬温。附件为一页纸、备忘录和路演</w:t>
+      </w:r>
+      <w:r>
+        <w:rPr>
+          <w:rStyle w:val="VerbatimChar"/>
+        </w:rPr>
+        <w:t xml:space="preserve"> </w:t>
+      </w:r>
+      <w:r>
+        <w:rPr>
+          <w:rStyle w:val="VerbatimChar"/>
+          <w:rFonts w:hint="eastAsia"/>
+        </w:rPr>
+        <w:t xml:space="preserve">PDF。方便时想演示商家发单、达人报名。</w:t>
       </w:r>
       <w:r>
         <w:br/>
@@ -3005,7 +2849,7 @@
           <w:rStyle w:val="VerbatimChar"/>
           <w:rFonts w:hint="eastAsia"/>
         </w:rPr>
-        <w:t xml:space="preserve">ERP：方案预览确认后写入系统，再通过星选小程序完成达人履约。不是再惠那样的高客单代运营，也不是通告墙。</w:t>
+        <w:t xml:space="preserve">ERP：方案确认后再写入系统，再通过星选小程序完成达人履约。不是高客单代运营公司。</w:t>
       </w:r>
       <w:r>
         <w:br/>
@@ -3101,7 +2945,20 @@
         <w:rPr>
           <w:rStyle w:val="VerbatimChar"/>
         </w:rPr>
-        <w:t xml:space="preserve">· AI 6,397 </w:t>
+        <w:t xml:space="preserve">· AI </w:t>
+      </w:r>
+      <w:r>
+        <w:rPr>
+          <w:rStyle w:val="VerbatimChar"/>
+          <w:rFonts w:hint="eastAsia"/>
+        </w:rPr>
+        <w:t xml:space="preserve">调用</w:t>
+      </w:r>
+      <w:r>
+        <w:rPr>
+          <w:rStyle w:val="VerbatimChar"/>
+        </w:rPr>
+        <w:t xml:space="preserve"> 6,397 </w:t>
       </w:r>
       <w:r>
         <w:rPr>
@@ -3111,25 +2968,6 @@
         <w:t xml:space="preserve">次</w:t>
       </w:r>
       <w:r>
-        <w:rPr>
-          <w:rStyle w:val="VerbatimChar"/>
-        </w:rPr>
-        <w:t xml:space="preserve"> / 1,224 </w:t>
-      </w:r>
-      <w:r>
-        <w:rPr>
-          <w:rStyle w:val="VerbatimChar"/>
-          <w:rFonts w:hint="eastAsia"/>
-        </w:rPr>
-        <w:t xml:space="preserve">万</w:t>
-      </w:r>
-      <w:r>
-        <w:rPr>
-          <w:rStyle w:val="VerbatimChar"/>
-        </w:rPr>
-        <w:t xml:space="preserve"> Token</w:t>
-      </w:r>
-      <w:r>
         <w:br/>
       </w:r>
       <w:r>
@@ -3156,13 +2994,13 @@
           <w:rStyle w:val="VerbatimChar"/>
           <w:rFonts w:hint="eastAsia"/>
         </w:rPr>
-        <w:t xml:space="preserve">单、平台</w:t>
-      </w:r>
-      <w:r>
-        <w:rPr>
-          <w:rStyle w:val="VerbatimChar"/>
-        </w:rPr>
-        <w:t xml:space="preserve"> GMV 733 </w:t>
+        <w:t xml:space="preserve">单、平台成交</w:t>
+      </w:r>
+      <w:r>
+        <w:rPr>
+          <w:rStyle w:val="VerbatimChar"/>
+        </w:rPr>
+        <w:t xml:space="preserve"> 733 </w:t>
       </w:r>
       <w:r>
         <w:rPr>
@@ -3198,7 +3036,7 @@
           <w:rStyle w:val="VerbatimChar"/>
           <w:rFonts w:hint="eastAsia"/>
         </w:rPr>
-        <w:t xml:space="preserve">万，规模化收费尚未起量</w:t>
+        <w:t xml:space="preserve">万，规模化收费还没起来</w:t>
       </w:r>
       <w:r>
         <w:br/>
@@ -3224,20 +3062,20 @@
           <w:rStyle w:val="VerbatimChar"/>
           <w:rFonts w:hint="eastAsia"/>
         </w:rPr>
-        <w:t xml:space="preserve">万，战场杭甬温。附件为一页纸、备忘录和路演</w:t>
-      </w:r>
-      <w:r>
-        <w:rPr>
-          <w:rStyle w:val="VerbatimChar"/>
-        </w:rPr>
-        <w:t xml:space="preserve"> </w:t>
-      </w:r>
-      <w:r>
-        <w:rPr>
-          <w:rStyle w:val="VerbatimChar"/>
-          <w:rFonts w:hint="eastAsia"/>
-        </w:rPr>
-        <w:t xml:space="preserve">PDF，希望占用</w:t>
+        <w:t xml:space="preserve">万元，只做杭甬温。附件为一页纸、备忘录和路演</w:t>
+      </w:r>
+      <w:r>
+        <w:rPr>
+          <w:rStyle w:val="VerbatimChar"/>
+        </w:rPr>
+        <w:t xml:space="preserve"> </w:t>
+      </w:r>
+      <w:r>
+        <w:rPr>
+          <w:rStyle w:val="VerbatimChar"/>
+          <w:rFonts w:hint="eastAsia"/>
+        </w:rPr>
+        <w:t xml:space="preserve">PDF。希望占用</w:t>
       </w:r>
       <w:r>
         <w:rPr>
@@ -3250,7 +3088,7 @@
           <w:rStyle w:val="VerbatimChar"/>
           <w:rFonts w:hint="eastAsia"/>
         </w:rPr>
-        <w:t xml:space="preserve">分钟走一遍真单。</w:t>
+        <w:t xml:space="preserve">分钟，现场看一遍真实订单。</w:t>
       </w:r>
       <w:r>
         <w:br/>
@@ -3442,7 +3280,7 @@
           <w:rStyle w:val="VerbatimChar"/>
           <w:rFonts w:hint="eastAsia"/>
         </w:rPr>
-        <w:t xml:space="preserve">ERP，加上可验证的达人履约。服务商版已有塔塔、极道、杭州意米、意米文化等租户；其中塔塔、极道、地锅鸡三家已把抖音来客订单同步进</w:t>
+        <w:t xml:space="preserve">ERP，也做达人履约。服务商版已有塔塔、极道、杭州意米、意米文化等客户；其中塔塔、极道、地锅鸡三家已把抖音来客订单同步进</w:t>
       </w:r>
       <w:r>
         <w:rPr>
@@ -3503,13 +3341,13 @@
           <w:rStyle w:val="VerbatimChar"/>
           <w:rFonts w:hint="eastAsia"/>
         </w:rPr>
-        <w:t xml:space="preserve">单、平台</w:t>
-      </w:r>
-      <w:r>
-        <w:rPr>
-          <w:rStyle w:val="VerbatimChar"/>
-        </w:rPr>
-        <w:t xml:space="preserve"> GMV 733 </w:t>
+        <w:t xml:space="preserve">单、平台成交</w:t>
+      </w:r>
+      <w:r>
+        <w:rPr>
+          <w:rStyle w:val="VerbatimChar"/>
+        </w:rPr>
+        <w:t xml:space="preserve"> 733 </w:t>
       </w:r>
       <w:r>
         <w:rPr>
@@ -3593,7 +3431,7 @@
           <w:rStyle w:val="VerbatimChar"/>
           <w:rFonts w:hint="eastAsia"/>
         </w:rPr>
-        <w:t xml:space="preserve">元/月档位和支付通道已通，确认到账约</w:t>
+        <w:t xml:space="preserve">元/月的档位和支付通道已通，确认到账约</w:t>
       </w:r>
       <w:r>
         <w:rPr>
@@ -3622,7 +3460,7 @@
           <w:rStyle w:val="VerbatimChar"/>
           <w:rFonts w:hint="eastAsia"/>
         </w:rPr>
-        <w:t xml:space="preserve">会员档位有赠送，不能当成经常性收入</w:t>
+        <w:t xml:space="preserve">部分会员档位是运营赠送，还不能当成经常性收入</w:t>
       </w:r>
       <w:r>
         <w:br/>
@@ -3661,20 +3499,7 @@
           <w:rStyle w:val="VerbatimChar"/>
           <w:rFonts w:hint="eastAsia"/>
         </w:rPr>
-        <w:t xml:space="preserve">ERP；733</w:t>
-      </w:r>
-      <w:r>
-        <w:rPr>
-          <w:rStyle w:val="VerbatimChar"/>
-        </w:rPr>
-        <w:t xml:space="preserve"> </w:t>
-      </w:r>
-      <w:r>
-        <w:rPr>
-          <w:rStyle w:val="VerbatimChar"/>
-          <w:rFonts w:hint="eastAsia"/>
-        </w:rPr>
-        <w:t xml:space="preserve">万是商户成交，不是公司收入。附件为一页纸、备忘录和路演</w:t>
+        <w:t xml:space="preserve">ERP。附件为一页纸、备忘录和路演</w:t>
       </w:r>
       <w:r>
         <w:rPr>
@@ -3872,59 +3697,33 @@
           <w:rStyle w:val="VerbatimChar"/>
           <w:rFonts w:hint="eastAsia"/>
         </w:rPr>
-        <w:t xml:space="preserve">我们把大模型嵌进本地生活经营工作流：AI</w:t>
-      </w:r>
-      <w:r>
-        <w:rPr>
-          <w:rStyle w:val="VerbatimChar"/>
-        </w:rPr>
-        <w:t xml:space="preserve"> </w:t>
-      </w:r>
-      <w:r>
-        <w:rPr>
-          <w:rStyle w:val="VerbatimChar"/>
-          <w:rFonts w:hint="eastAsia"/>
-        </w:rPr>
-        <w:t xml:space="preserve">生成组品</w:t>
-      </w:r>
-      <w:r>
-        <w:rPr>
-          <w:rStyle w:val="VerbatimChar"/>
-        </w:rPr>
-        <w:t xml:space="preserve"> / Brief / </w:t>
-      </w:r>
-      <w:r>
-        <w:rPr>
-          <w:rStyle w:val="VerbatimChar"/>
-          <w:rFonts w:hint="eastAsia"/>
-        </w:rPr>
-        <w:t xml:space="preserve">店铺分析</w:t>
-      </w:r>
-      <w:r>
-        <w:rPr>
-          <w:rStyle w:val="VerbatimChar"/>
-        </w:rPr>
-        <w:t xml:space="preserve"> / </w:t>
-      </w:r>
-      <w:r>
-        <w:rPr>
-          <w:rStyle w:val="VerbatimChar"/>
-          <w:rFonts w:hint="eastAsia"/>
-        </w:rPr>
-        <w:t xml:space="preserve">短视频，必须预览确认后才写入</w:t>
-      </w:r>
-      <w:r>
-        <w:rPr>
-          <w:rStyle w:val="VerbatimChar"/>
-        </w:rPr>
-        <w:t xml:space="preserve"> </w:t>
-      </w:r>
-      <w:r>
-        <w:rPr>
-          <w:rStyle w:val="VerbatimChar"/>
-          <w:rFonts w:hint="eastAsia"/>
-        </w:rPr>
-        <w:t xml:space="preserve">ERP，再由星选完成达人履约和回链。</w:t>
+        <w:t xml:space="preserve">我们把大模型用在本地生活经营里：AI</w:t>
+      </w:r>
+      <w:r>
+        <w:rPr>
+          <w:rStyle w:val="VerbatimChar"/>
+        </w:rPr>
+        <w:t xml:space="preserve"> </w:t>
+      </w:r>
+      <w:r>
+        <w:rPr>
+          <w:rStyle w:val="VerbatimChar"/>
+          <w:rFonts w:hint="eastAsia"/>
+        </w:rPr>
+        <w:t xml:space="preserve">生成组品、店铺分析和短视频，商户确认后再写入</w:t>
+      </w:r>
+      <w:r>
+        <w:rPr>
+          <w:rStyle w:val="VerbatimChar"/>
+        </w:rPr>
+        <w:t xml:space="preserve"> </w:t>
+      </w:r>
+      <w:r>
+        <w:rPr>
+          <w:rStyle w:val="VerbatimChar"/>
+          <w:rFonts w:hint="eastAsia"/>
+        </w:rPr>
+        <w:t xml:space="preserve">ERP，再由星选完成达人履约和回传。</w:t>
       </w:r>
       <w:r>
         <w:br/>
@@ -3966,7 +3765,7 @@
           <w:rStyle w:val="VerbatimChar"/>
           <w:rFonts w:hint="eastAsia"/>
         </w:rPr>
-        <w:t xml:space="preserve">累计</w:t>
+        <w:t xml:space="preserve">累计调用</w:t>
       </w:r>
       <w:r>
         <w:rPr>
@@ -3979,13 +3778,187 @@
           <w:rStyle w:val="VerbatimChar"/>
           <w:rFonts w:hint="eastAsia"/>
         </w:rPr>
-        <w:t xml:space="preserve">次、1,224</w:t>
-      </w:r>
-      <w:r>
-        <w:rPr>
-          <w:rStyle w:val="VerbatimChar"/>
-        </w:rPr>
-        <w:t xml:space="preserve"> </w:t>
+        <w:t xml:space="preserve">次，7</w:t>
+      </w:r>
+      <w:r>
+        <w:rPr>
+          <w:rStyle w:val="VerbatimChar"/>
+        </w:rPr>
+        <w:t xml:space="preserve"> </w:t>
+      </w:r>
+      <w:r>
+        <w:rPr>
+          <w:rStyle w:val="VerbatimChar"/>
+          <w:rFonts w:hint="eastAsia"/>
+        </w:rPr>
+        <w:t xml:space="preserve">月高峰</w:t>
+      </w:r>
+      <w:r>
+        <w:rPr>
+          <w:rStyle w:val="VerbatimChar"/>
+        </w:rPr>
+        <w:t xml:space="preserve"> 4,286 </w:t>
+      </w:r>
+      <w:r>
+        <w:rPr>
+          <w:rStyle w:val="VerbatimChar"/>
+          <w:rFonts w:hint="eastAsia"/>
+        </w:rPr>
+        <w:t xml:space="preserve">次</w:t>
+      </w:r>
+      <w:r>
+        <w:br/>
+      </w:r>
+      <w:r>
+        <w:rPr>
+          <w:rStyle w:val="VerbatimChar"/>
+        </w:rPr>
+        <w:t xml:space="preserve">· </w:t>
+      </w:r>
+      <w:r>
+        <w:rPr>
+          <w:rStyle w:val="VerbatimChar"/>
+          <w:rFonts w:hint="eastAsia"/>
+        </w:rPr>
+        <w:t xml:space="preserve">生产接口</w:t>
+      </w:r>
+      <w:r>
+        <w:rPr>
+          <w:rStyle w:val="VerbatimChar"/>
+        </w:rPr>
+        <w:t xml:space="preserve"> 212 </w:t>
+      </w:r>
+      <w:r>
+        <w:rPr>
+          <w:rStyle w:val="VerbatimChar"/>
+          <w:rFonts w:hint="eastAsia"/>
+        </w:rPr>
+        <w:t xml:space="preserve">条，主机连续运行</w:t>
+      </w:r>
+      <w:r>
+        <w:rPr>
+          <w:rStyle w:val="VerbatimChar"/>
+        </w:rPr>
+        <w:t xml:space="preserve"> 100 </w:t>
+      </w:r>
+      <w:r>
+        <w:rPr>
+          <w:rStyle w:val="VerbatimChar"/>
+          <w:rFonts w:hint="eastAsia"/>
+        </w:rPr>
+        <w:t xml:space="preserve">天</w:t>
+      </w:r>
+      <w:r>
+        <w:br/>
+      </w:r>
+      <w:r>
+        <w:rPr>
+          <w:rStyle w:val="VerbatimChar"/>
+        </w:rPr>
+        <w:t xml:space="preserve">· </w:t>
+      </w:r>
+      <w:r>
+        <w:rPr>
+          <w:rStyle w:val="VerbatimChar"/>
+          <w:rFonts w:hint="eastAsia"/>
+        </w:rPr>
+        <w:t xml:space="preserve">星选会员</w:t>
+      </w:r>
+      <w:r>
+        <w:rPr>
+          <w:rStyle w:val="VerbatimChar"/>
+        </w:rPr>
+        <w:t xml:space="preserve"> </w:t>
+      </w:r>
+      <w:r>
+        <w:rPr>
+          <w:rStyle w:val="VerbatimChar"/>
+          <w:rFonts w:hint="eastAsia"/>
+        </w:rPr>
+        <w:t xml:space="preserve">737，招募</w:t>
+      </w:r>
+      <w:r>
+        <w:rPr>
+          <w:rStyle w:val="VerbatimChar"/>
+        </w:rPr>
+        <w:t xml:space="preserve"> </w:t>
+      </w:r>
+      <w:r>
+        <w:rPr>
+          <w:rStyle w:val="VerbatimChar"/>
+          <w:rFonts w:hint="eastAsia"/>
+        </w:rPr>
+        <w:t xml:space="preserve">293，报名</w:t>
+      </w:r>
+      <w:r>
+        <w:rPr>
+          <w:rStyle w:val="VerbatimChar"/>
+        </w:rPr>
+        <w:t xml:space="preserve"> 1,979</w:t>
+      </w:r>
+      <w:r>
+        <w:br/>
+      </w:r>
+      <w:r>
+        <w:rPr>
+          <w:rStyle w:val="VerbatimChar"/>
+        </w:rPr>
+        <w:t xml:space="preserve">· 3 </w:t>
+      </w:r>
+      <w:r>
+        <w:rPr>
+          <w:rStyle w:val="VerbatimChar"/>
+          <w:rFonts w:hint="eastAsia"/>
+        </w:rPr>
+        <w:t xml:space="preserve">家深度店同步</w:t>
+      </w:r>
+      <w:r>
+        <w:rPr>
+          <w:rStyle w:val="VerbatimChar"/>
+        </w:rPr>
+        <w:t xml:space="preserve"> 59,643 </w:t>
+      </w:r>
+      <w:r>
+        <w:rPr>
+          <w:rStyle w:val="VerbatimChar"/>
+          <w:rFonts w:hint="eastAsia"/>
+        </w:rPr>
+        <w:t xml:space="preserve">单抖音订单；733</w:t>
+      </w:r>
+      <w:r>
+        <w:rPr>
+          <w:rStyle w:val="VerbatimChar"/>
+        </w:rPr>
+        <w:t xml:space="preserve"> </w:t>
+      </w:r>
+      <w:r>
+        <w:rPr>
+          <w:rStyle w:val="VerbatimChar"/>
+          <w:rFonts w:hint="eastAsia"/>
+        </w:rPr>
+        <w:t xml:space="preserve">万是商户成交，不是公司收入</w:t>
+      </w:r>
+      <w:r>
+        <w:br/>
+      </w:r>
+      <w:r>
+        <w:rPr>
+          <w:rStyle w:val="VerbatimChar"/>
+        </w:rPr>
+        <w:t xml:space="preserve">· </w:t>
+      </w:r>
+      <w:r>
+        <w:rPr>
+          <w:rStyle w:val="VerbatimChar"/>
+          <w:rFonts w:hint="eastAsia"/>
+        </w:rPr>
+        <w:t xml:space="preserve">确认到账约</w:t>
+      </w:r>
+      <w:r>
+        <w:rPr>
+          <w:rStyle w:val="VerbatimChar"/>
+        </w:rPr>
+        <w:t xml:space="preserve"> 0.29 </w:t>
       </w:r>
       <w:r>
         <w:rPr>
@@ -3995,206 +3968,6 @@
         <w:t xml:space="preserve">万</w:t>
       </w:r>
       <w:r>
-        <w:rPr>
-          <w:rStyle w:val="VerbatimChar"/>
-        </w:rPr>
-        <w:t xml:space="preserve"> </w:t>
-      </w:r>
-      <w:r>
-        <w:rPr>
-          <w:rStyle w:val="VerbatimChar"/>
-          <w:rFonts w:hint="eastAsia"/>
-        </w:rPr>
-        <w:t xml:space="preserve">Token，7</w:t>
-      </w:r>
-      <w:r>
-        <w:rPr>
-          <w:rStyle w:val="VerbatimChar"/>
-        </w:rPr>
-        <w:t xml:space="preserve"> </w:t>
-      </w:r>
-      <w:r>
-        <w:rPr>
-          <w:rStyle w:val="VerbatimChar"/>
-          <w:rFonts w:hint="eastAsia"/>
-        </w:rPr>
-        <w:t xml:space="preserve">月高峰</w:t>
-      </w:r>
-      <w:r>
-        <w:rPr>
-          <w:rStyle w:val="VerbatimChar"/>
-        </w:rPr>
-        <w:t xml:space="preserve"> 4,286 </w:t>
-      </w:r>
-      <w:r>
-        <w:rPr>
-          <w:rStyle w:val="VerbatimChar"/>
-          <w:rFonts w:hint="eastAsia"/>
-        </w:rPr>
-        <w:t xml:space="preserve">次</w:t>
-      </w:r>
-      <w:r>
-        <w:br/>
-      </w:r>
-      <w:r>
-        <w:rPr>
-          <w:rStyle w:val="VerbatimChar"/>
-        </w:rPr>
-        <w:t xml:space="preserve">· </w:t>
-      </w:r>
-      <w:r>
-        <w:rPr>
-          <w:rStyle w:val="VerbatimChar"/>
-          <w:rFonts w:hint="eastAsia"/>
-        </w:rPr>
-        <w:t xml:space="preserve">生产</w:t>
-      </w:r>
-      <w:r>
-        <w:rPr>
-          <w:rStyle w:val="VerbatimChar"/>
-        </w:rPr>
-        <w:t xml:space="preserve"> API 212 </w:t>
-      </w:r>
-      <w:r>
-        <w:rPr>
-          <w:rStyle w:val="VerbatimChar"/>
-          <w:rFonts w:hint="eastAsia"/>
-        </w:rPr>
-        <w:t xml:space="preserve">条，主机连续运行</w:t>
-      </w:r>
-      <w:r>
-        <w:rPr>
-          <w:rStyle w:val="VerbatimChar"/>
-        </w:rPr>
-        <w:t xml:space="preserve"> 100 </w:t>
-      </w:r>
-      <w:r>
-        <w:rPr>
-          <w:rStyle w:val="VerbatimChar"/>
-          <w:rFonts w:hint="eastAsia"/>
-        </w:rPr>
-        <w:t xml:space="preserve">天</w:t>
-      </w:r>
-      <w:r>
-        <w:br/>
-      </w:r>
-      <w:r>
-        <w:rPr>
-          <w:rStyle w:val="VerbatimChar"/>
-        </w:rPr>
-        <w:t xml:space="preserve">· </w:t>
-      </w:r>
-      <w:r>
-        <w:rPr>
-          <w:rStyle w:val="VerbatimChar"/>
-          <w:rFonts w:hint="eastAsia"/>
-        </w:rPr>
-        <w:t xml:space="preserve">星选会员</w:t>
-      </w:r>
-      <w:r>
-        <w:rPr>
-          <w:rStyle w:val="VerbatimChar"/>
-        </w:rPr>
-        <w:t xml:space="preserve"> </w:t>
-      </w:r>
-      <w:r>
-        <w:rPr>
-          <w:rStyle w:val="VerbatimChar"/>
-          <w:rFonts w:hint="eastAsia"/>
-        </w:rPr>
-        <w:t xml:space="preserve">737，招募</w:t>
-      </w:r>
-      <w:r>
-        <w:rPr>
-          <w:rStyle w:val="VerbatimChar"/>
-        </w:rPr>
-        <w:t xml:space="preserve"> </w:t>
-      </w:r>
-      <w:r>
-        <w:rPr>
-          <w:rStyle w:val="VerbatimChar"/>
-          <w:rFonts w:hint="eastAsia"/>
-        </w:rPr>
-        <w:t xml:space="preserve">293，报名</w:t>
-      </w:r>
-      <w:r>
-        <w:rPr>
-          <w:rStyle w:val="VerbatimChar"/>
-        </w:rPr>
-        <w:t xml:space="preserve"> 1,979</w:t>
-      </w:r>
-      <w:r>
-        <w:br/>
-      </w:r>
-      <w:r>
-        <w:rPr>
-          <w:rStyle w:val="VerbatimChar"/>
-        </w:rPr>
-        <w:t xml:space="preserve">· 3 </w:t>
-      </w:r>
-      <w:r>
-        <w:rPr>
-          <w:rStyle w:val="VerbatimChar"/>
-          <w:rFonts w:hint="eastAsia"/>
-        </w:rPr>
-        <w:t xml:space="preserve">家深度店同步</w:t>
-      </w:r>
-      <w:r>
-        <w:rPr>
-          <w:rStyle w:val="VerbatimChar"/>
-        </w:rPr>
-        <w:t xml:space="preserve"> 59,643 </w:t>
-      </w:r>
-      <w:r>
-        <w:rPr>
-          <w:rStyle w:val="VerbatimChar"/>
-          <w:rFonts w:hint="eastAsia"/>
-        </w:rPr>
-        <w:t xml:space="preserve">单抖音订单；733</w:t>
-      </w:r>
-      <w:r>
-        <w:rPr>
-          <w:rStyle w:val="VerbatimChar"/>
-        </w:rPr>
-        <w:t xml:space="preserve"> </w:t>
-      </w:r>
-      <w:r>
-        <w:rPr>
-          <w:rStyle w:val="VerbatimChar"/>
-          <w:rFonts w:hint="eastAsia"/>
-        </w:rPr>
-        <w:t xml:space="preserve">万是商户成交，不是公司收入</w:t>
-      </w:r>
-      <w:r>
-        <w:br/>
-      </w:r>
-      <w:r>
-        <w:rPr>
-          <w:rStyle w:val="VerbatimChar"/>
-        </w:rPr>
-        <w:t xml:space="preserve">· </w:t>
-      </w:r>
-      <w:r>
-        <w:rPr>
-          <w:rStyle w:val="VerbatimChar"/>
-          <w:rFonts w:hint="eastAsia"/>
-        </w:rPr>
-        <w:t xml:space="preserve">确认到账约</w:t>
-      </w:r>
-      <w:r>
-        <w:rPr>
-          <w:rStyle w:val="VerbatimChar"/>
-        </w:rPr>
-        <w:t xml:space="preserve"> 0.29 </w:t>
-      </w:r>
-      <w:r>
-        <w:rPr>
-          <w:rStyle w:val="VerbatimChar"/>
-          <w:rFonts w:hint="eastAsia"/>
-        </w:rPr>
-        <w:t xml:space="preserve">万</w:t>
-      </w:r>
-      <w:r>
         <w:br/>
       </w:r>
       <w:r>
@@ -4218,20 +3991,20 @@
           <w:rStyle w:val="VerbatimChar"/>
           <w:rFonts w:hint="eastAsia"/>
         </w:rPr>
-        <w:t xml:space="preserve">万，先在杭甬温把单位经济做审计。附件为一页纸、备忘录和路演</w:t>
-      </w:r>
-      <w:r>
-        <w:rPr>
-          <w:rStyle w:val="VerbatimChar"/>
-        </w:rPr>
-        <w:t xml:space="preserve"> </w:t>
-      </w:r>
-      <w:r>
-        <w:rPr>
-          <w:rStyle w:val="VerbatimChar"/>
-          <w:rFonts w:hint="eastAsia"/>
-        </w:rPr>
-        <w:t xml:space="preserve">PDF，方便时演示主链路。</w:t>
+        <w:t xml:space="preserve">万元，先在杭甬温把收费和成本算清楚。附件为一页纸、备忘录和路演</w:t>
+      </w:r>
+      <w:r>
+        <w:rPr>
+          <w:rStyle w:val="VerbatimChar"/>
+        </w:rPr>
+        <w:t xml:space="preserve"> </w:t>
+      </w:r>
+      <w:r>
+        <w:rPr>
+          <w:rStyle w:val="VerbatimChar"/>
+          <w:rFonts w:hint="eastAsia"/>
+        </w:rPr>
+        <w:t xml:space="preserve">PDF。方便时想演示商家发单、达人报名。</w:t>
       </w:r>
       <w:r>
         <w:br/>
@@ -4411,7 +4184,7 @@
           <w:rStyle w:val="VerbatimChar"/>
           <w:rFonts w:hint="eastAsia"/>
         </w:rPr>
-        <w:t xml:space="preserve">人，供给留在浙南</w:t>
+        <w:t xml:space="preserve">人</w:t>
       </w:r>
     </w:p>
     <w:p>
@@ -4449,13 +4222,13 @@
           <w:rStyle w:val="VerbatimChar"/>
           <w:rFonts w:hint="eastAsia"/>
         </w:rPr>
-        <w:t xml:space="preserve">公司主体在宁波，星选达人供给主要在温州。我们希望把数字化工具同时留给浙南商户和达人：商家用灵祺</w:t>
-      </w:r>
-      <w:r>
-        <w:rPr>
-          <w:rStyle w:val="VerbatimChar"/>
-        </w:rPr>
-        <w:t xml:space="preserve"> ERP </w:t>
+        <w:t xml:space="preserve">公司在宁波，星选达人主要在温州。商家用灵祺</w:t>
+      </w:r>
+      <w:r>
+        <w:rPr>
+          <w:rStyle w:val="VerbatimChar"/>
+        </w:rPr>
+        <w:t xml:space="preserve"> AI ERP </w:t>
       </w:r>
       <w:r>
         <w:rPr>
@@ -4578,20 +4351,20 @@
           <w:rStyle w:val="VerbatimChar"/>
           <w:rFonts w:hint="eastAsia"/>
         </w:rPr>
-        <w:t xml:space="preserve">万，≥10</w:t>
-      </w:r>
-      <w:r>
-        <w:rPr>
-          <w:rStyle w:val="VerbatimChar"/>
-        </w:rPr>
-        <w:t xml:space="preserve"> </w:t>
-      </w:r>
-      <w:r>
-        <w:rPr>
-          <w:rStyle w:val="VerbatimChar"/>
-          <w:rFonts w:hint="eastAsia"/>
-        </w:rPr>
-        <w:t xml:space="preserve">万粉</w:t>
+        <w:t xml:space="preserve">万，10</w:t>
+      </w:r>
+      <w:r>
+        <w:rPr>
+          <w:rStyle w:val="VerbatimChar"/>
+        </w:rPr>
+        <w:t xml:space="preserve"> </w:t>
+      </w:r>
+      <w:r>
+        <w:rPr>
+          <w:rStyle w:val="VerbatimChar"/>
+          <w:rFonts w:hint="eastAsia"/>
+        </w:rPr>
+        <w:t xml:space="preserve">万粉以上</w:t>
       </w:r>
       <w:r>
         <w:rPr>
@@ -4668,13 +4441,13 @@
           <w:rStyle w:val="VerbatimChar"/>
           <w:rFonts w:hint="eastAsia"/>
         </w:rPr>
-        <w:t xml:space="preserve">单、平台</w:t>
-      </w:r>
-      <w:r>
-        <w:rPr>
-          <w:rStyle w:val="VerbatimChar"/>
-        </w:rPr>
-        <w:t xml:space="preserve"> GMV 733 </w:t>
+        <w:t xml:space="preserve">单、平台成交</w:t>
+      </w:r>
+      <w:r>
+        <w:rPr>
+          <w:rStyle w:val="VerbatimChar"/>
+        </w:rPr>
+        <w:t xml:space="preserve"> 733 </w:t>
       </w:r>
       <w:r>
         <w:rPr>
@@ -4736,7 +4509,7 @@
           <w:rStyle w:val="VerbatimChar"/>
           <w:rFonts w:hint="eastAsia"/>
         </w:rPr>
-        <w:t xml:space="preserve">万。主体虽在宁波，温州已是可验证的单城供给样板。附件为一页纸、备忘录和路演</w:t>
+        <w:t xml:space="preserve">万元。公司在宁波，温州已经能看出一座城市的达人供给。附件为一页纸、备忘录和路演</w:t>
       </w:r>
       <w:r>
         <w:rPr>
@@ -4878,14 +4651,14 @@
         <w:rPr>
           <w:rStyle w:val="VerbatimChar"/>
         </w:rPr>
-        <w:t xml:space="preserve"> AI ERP </w:t>
-      </w:r>
-      <w:r>
-        <w:rPr>
-          <w:rStyle w:val="VerbatimChar"/>
-          <w:rFonts w:hint="eastAsia"/>
-        </w:rPr>
-        <w:t xml:space="preserve">已写入经营工作流｜宁波墨典</w:t>
+        <w:t xml:space="preserve"> AI ERP + </w:t>
+      </w:r>
+      <w:r>
+        <w:rPr>
+          <w:rStyle w:val="VerbatimChar"/>
+          <w:rFonts w:hint="eastAsia"/>
+        </w:rPr>
+        <w:t xml:space="preserve">星选履约｜宁波墨典</w:t>
       </w:r>
     </w:p>
     <w:p>
@@ -4936,20 +4709,20 @@
           <w:rStyle w:val="VerbatimChar"/>
           <w:rFonts w:hint="eastAsia"/>
         </w:rPr>
-        <w:t xml:space="preserve">能力嵌进商家</w:t>
-      </w:r>
-      <w:r>
-        <w:rPr>
-          <w:rStyle w:val="VerbatimChar"/>
-        </w:rPr>
-        <w:t xml:space="preserve"> </w:t>
-      </w:r>
-      <w:r>
-        <w:rPr>
-          <w:rStyle w:val="VerbatimChar"/>
-          <w:rFonts w:hint="eastAsia"/>
-        </w:rPr>
-        <w:t xml:space="preserve">ERP：预览确认后写入系统，再通过星选完成达人履约，而不是停在聊天窗口。</w:t>
+        <w:t xml:space="preserve">用在商家</w:t>
+      </w:r>
+      <w:r>
+        <w:rPr>
+          <w:rStyle w:val="VerbatimChar"/>
+        </w:rPr>
+        <w:t xml:space="preserve"> ERP </w:t>
+      </w:r>
+      <w:r>
+        <w:rPr>
+          <w:rStyle w:val="VerbatimChar"/>
+          <w:rFonts w:hint="eastAsia"/>
+        </w:rPr>
+        <w:t xml:space="preserve">里：商户确认后再写入系统，再通过星选完成达人履约。</w:t>
       </w:r>
       <w:r>
         <w:br/>
@@ -4994,27 +4767,27 @@
         <w:rPr>
           <w:rStyle w:val="VerbatimChar"/>
         </w:rPr>
-        <w:t xml:space="preserve"> 293 / </w:t>
-      </w:r>
-      <w:r>
-        <w:rPr>
-          <w:rStyle w:val="VerbatimChar"/>
-          <w:rFonts w:hint="eastAsia"/>
-        </w:rPr>
-        <w:t xml:space="preserve">报名</w:t>
-      </w:r>
-      <w:r>
-        <w:rPr>
-          <w:rStyle w:val="VerbatimChar"/>
-        </w:rPr>
-        <w:t xml:space="preserve"> </w:t>
-      </w:r>
-      <w:r>
-        <w:rPr>
-          <w:rStyle w:val="VerbatimChar"/>
-          <w:rFonts w:hint="eastAsia"/>
-        </w:rPr>
-        <w:t xml:space="preserve">1,979，3</w:t>
+        <w:t xml:space="preserve"> </w:t>
+      </w:r>
+      <w:r>
+        <w:rPr>
+          <w:rStyle w:val="VerbatimChar"/>
+          <w:rFonts w:hint="eastAsia"/>
+        </w:rPr>
+        <w:t xml:space="preserve">293，报名</w:t>
+      </w:r>
+      <w:r>
+        <w:rPr>
+          <w:rStyle w:val="VerbatimChar"/>
+        </w:rPr>
+        <w:t xml:space="preserve"> </w:t>
+      </w:r>
+      <w:r>
+        <w:rPr>
+          <w:rStyle w:val="VerbatimChar"/>
+          <w:rFonts w:hint="eastAsia"/>
+        </w:rPr>
+        <w:t xml:space="preserve">1,979；3</w:t>
       </w:r>
       <w:r>
         <w:rPr>
@@ -5040,7 +4813,7 @@
           <w:rStyle w:val="VerbatimChar"/>
           <w:rFonts w:hint="eastAsia"/>
         </w:rPr>
-        <w:t xml:space="preserve">单抖音订单；733</w:t>
+        <w:t xml:space="preserve">单抖音订单。733</w:t>
       </w:r>
       <w:r>
         <w:rPr>
@@ -5066,7 +4839,7 @@
           <w:rStyle w:val="VerbatimChar"/>
           <w:rFonts w:hint="eastAsia"/>
         </w:rPr>
-        <w:t xml:space="preserve">万，本轮种子</w:t>
+        <w:t xml:space="preserve">万。本轮种子目标</w:t>
       </w:r>
       <w:r>
         <w:rPr>
@@ -5079,7 +4852,7 @@
           <w:rStyle w:val="VerbatimChar"/>
           <w:rFonts w:hint="eastAsia"/>
         </w:rPr>
-        <w:t xml:space="preserve">万用于做成经常性收入，战场杭甬温。</w:t>
+        <w:t xml:space="preserve">万元，只做杭甬温，要把现有用量做成经常性收入。</w:t>
       </w:r>
       <w:r>
         <w:br/>
@@ -5105,7 +4878,7 @@
           <w:rStyle w:val="VerbatimChar"/>
           <w:rFonts w:hint="eastAsia"/>
         </w:rPr>
-        <w:t xml:space="preserve">PDF。若方便，想申请</w:t>
+        <w:t xml:space="preserve">PDF。若方便，想占用</w:t>
       </w:r>
       <w:r>
         <w:rPr>
@@ -5317,33 +5090,20 @@
           <w:rStyle w:val="VerbatimChar"/>
           <w:rFonts w:hint="eastAsia"/>
         </w:rPr>
-        <w:t xml:space="preserve">灵祺做跨平台经营编排：组品、达人招募、履约回链在同一套系统里，不替代抖音</w:t>
-      </w:r>
-      <w:r>
-        <w:rPr>
-          <w:rStyle w:val="VerbatimChar"/>
-        </w:rPr>
-        <w:t xml:space="preserve"> / </w:t>
-      </w:r>
-      <w:r>
-        <w:rPr>
-          <w:rStyle w:val="VerbatimChar"/>
-          <w:rFonts w:hint="eastAsia"/>
-        </w:rPr>
-        <w:t xml:space="preserve">美团的交易和资金。和有赞的差异是原生撮合</w:t>
-      </w:r>
-      <w:r>
-        <w:rPr>
-          <w:rStyle w:val="VerbatimChar"/>
-        </w:rPr>
-        <w:t xml:space="preserve"> + </w:t>
-      </w:r>
-      <w:r>
-        <w:rPr>
-          <w:rStyle w:val="VerbatimChar"/>
-          <w:rFonts w:hint="eastAsia"/>
-        </w:rPr>
-        <w:t xml:space="preserve">回链核查，加上杭甬温的区域密度。</w:t>
+        <w:t xml:space="preserve">灵祺把组品、找达人、履约回传放在同一套</w:t>
+      </w:r>
+      <w:r>
+        <w:rPr>
+          <w:rStyle w:val="VerbatimChar"/>
+        </w:rPr>
+        <w:t xml:space="preserve"> AI ERP </w:t>
+      </w:r>
+      <w:r>
+        <w:rPr>
+          <w:rStyle w:val="VerbatimChar"/>
+          <w:rFonts w:hint="eastAsia"/>
+        </w:rPr>
+        <w:t xml:space="preserve">里，不替代抖音、美团的交易和资金。和有赞的差别是我们自己有达人履约，先把杭甬温做深。</w:t>
       </w:r>
       <w:r>
         <w:br/>
@@ -5446,13 +5206,13 @@
           <w:rStyle w:val="VerbatimChar"/>
           <w:rFonts w:hint="eastAsia"/>
         </w:rPr>
-        <w:t xml:space="preserve">单、平台</w:t>
-      </w:r>
-      <w:r>
-        <w:rPr>
-          <w:rStyle w:val="VerbatimChar"/>
-        </w:rPr>
-        <w:t xml:space="preserve"> GMV 733 </w:t>
+        <w:t xml:space="preserve">单、平台成交</w:t>
+      </w:r>
+      <w:r>
+        <w:rPr>
+          <w:rStyle w:val="VerbatimChar"/>
+        </w:rPr>
+        <w:t xml:space="preserve"> 733 </w:t>
       </w:r>
       <w:r>
         <w:rPr>
@@ -5468,7 +5228,20 @@
         <w:rPr>
           <w:rStyle w:val="VerbatimChar"/>
         </w:rPr>
-        <w:t xml:space="preserve">· AI 6,397 </w:t>
+        <w:t xml:space="preserve">· AI </w:t>
+      </w:r>
+      <w:r>
+        <w:rPr>
+          <w:rStyle w:val="VerbatimChar"/>
+          <w:rFonts w:hint="eastAsia"/>
+        </w:rPr>
+        <w:t xml:space="preserve">调用</w:t>
+      </w:r>
+      <w:r>
+        <w:rPr>
+          <w:rStyle w:val="VerbatimChar"/>
+        </w:rPr>
+        <w:t xml:space="preserve"> 6,397 </w:t>
       </w:r>
       <w:r>
         <w:rPr>
@@ -5501,7 +5274,7 @@
           <w:rStyle w:val="VerbatimChar"/>
           <w:rFonts w:hint="eastAsia"/>
         </w:rPr>
-        <w:t xml:space="preserve">本轮种子</w:t>
+        <w:t xml:space="preserve">本轮种子目标</w:t>
       </w:r>
       <w:r>
         <w:rPr>
@@ -5514,20 +5287,20 @@
           <w:rStyle w:val="VerbatimChar"/>
           <w:rFonts w:hint="eastAsia"/>
         </w:rPr>
-        <w:t xml:space="preserve">万，18</w:t>
-      </w:r>
-      <w:r>
-        <w:rPr>
-          <w:rStyle w:val="VerbatimChar"/>
-        </w:rPr>
-        <w:t xml:space="preserve"> </w:t>
-      </w:r>
-      <w:r>
-        <w:rPr>
-          <w:rStyle w:val="VerbatimChar"/>
-          <w:rFonts w:hint="eastAsia"/>
-        </w:rPr>
-        <w:t xml:space="preserve">个月把订阅、履约、服务商导入做成可审计单位经济。附件为一页纸、备忘录和路演</w:t>
+        <w:t xml:space="preserve">万元，计划用</w:t>
+      </w:r>
+      <w:r>
+        <w:rPr>
+          <w:rStyle w:val="VerbatimChar"/>
+        </w:rPr>
+        <w:t xml:space="preserve"> 18 </w:t>
+      </w:r>
+      <w:r>
+        <w:rPr>
+          <w:rStyle w:val="VerbatimChar"/>
+          <w:rFonts w:hint="eastAsia"/>
+        </w:rPr>
+        <w:t xml:space="preserve">个月把订阅和履约做成能算清楚的收费。附件为一页纸、备忘录和路演</w:t>
       </w:r>
       <w:r>
         <w:rPr>
@@ -5720,20 +5493,20 @@
           <w:rStyle w:val="VerbatimChar"/>
           <w:rFonts w:hint="eastAsia"/>
         </w:rPr>
-        <w:t xml:space="preserve">我们做本地生活商家</w:t>
-      </w:r>
-      <w:r>
-        <w:rPr>
-          <w:rStyle w:val="VerbatimChar"/>
-        </w:rPr>
-        <w:t xml:space="preserve"> ERP + </w:t>
-      </w:r>
-      <w:r>
-        <w:rPr>
-          <w:rStyle w:val="VerbatimChar"/>
-          <w:rFonts w:hint="eastAsia"/>
-        </w:rPr>
-        <w:t xml:space="preserve">星选达人履约。主体在宁波，温州已有</w:t>
+        <w:t xml:space="preserve">我们做本地生活</w:t>
+      </w:r>
+      <w:r>
+        <w:rPr>
+          <w:rStyle w:val="VerbatimChar"/>
+        </w:rPr>
+        <w:t xml:space="preserve"> AI ERP </w:t>
+      </w:r>
+      <w:r>
+        <w:rPr>
+          <w:rStyle w:val="VerbatimChar"/>
+          <w:rFonts w:hint="eastAsia"/>
+        </w:rPr>
+        <w:t xml:space="preserve">和星选达人履约。公司在宁波，温州已有</w:t>
       </w:r>
       <w:r>
         <w:rPr>
@@ -5811,7 +5584,7 @@
           <w:rStyle w:val="VerbatimChar"/>
           <w:rFonts w:hint="eastAsia"/>
         </w:rPr>
-        <w:t xml:space="preserve">万是商户成交，不是公司收入。确认到账仍薄，本轮种子</w:t>
+        <w:t xml:space="preserve">万是商户成交，不是公司收入。确认收款还很少，本轮种子目标</w:t>
       </w:r>
       <w:r>
         <w:rPr>
@@ -5824,7 +5597,7 @@
           <w:rStyle w:val="VerbatimChar"/>
           <w:rFonts w:hint="eastAsia"/>
         </w:rPr>
-        <w:t xml:space="preserve">万要把收费跑起来。</w:t>
+        <w:t xml:space="preserve">万元，要把收费跑起来。</w:t>
       </w:r>
       <w:r>
         <w:br/>
@@ -5863,7 +5636,7 @@
           <w:rStyle w:val="VerbatimChar"/>
           <w:rFonts w:hint="eastAsia"/>
         </w:rPr>
-        <w:t xml:space="preserve">分钟走一遍真单。</w:t>
+        <w:t xml:space="preserve">分钟看一遍真实订单。</w:t>
       </w:r>
       <w:r>
         <w:br/>

</xml_diff>

<commit_message>
Demote Wenzhou city fund from must-send outreach.
Ningbo municipal money is already the angel guide fund; a Wenzhou cold email is the wrong local match after the company registered in Ningbo.

Co-authored-by: Cursor <cursoragent@cursor.com>
</commit_message>
<xml_diff>
--- a/docs/seed-round-202609/各机构邮件模板.docx
+++ b/docs/seed-round-202609/各机构邮件模板.docx
@@ -4046,13 +4046,13 @@
       </w:r>
     </w:p>
     <w:bookmarkEnd w:id="16"/>
-    <w:bookmarkStart w:id="17" w:name="p1-5-温州市基金-科创体系"/>
+    <w:bookmarkStart w:id="17" w:name="p2-0-温州市基金-科创体系"/>
     <w:p>
       <w:pPr>
         <w:pStyle w:val="Heading2"/>
       </w:pPr>
       <w:r>
-        <w:t xml:space="preserve">P1-5 </w:t>
+        <w:t xml:space="preserve">P2-0 </w:t>
       </w:r>
       <w:r>
         <w:rPr>
@@ -4073,6 +4073,28 @@
     <w:p>
       <w:pPr>
         <w:pStyle w:val="FirstParagraph"/>
+      </w:pPr>
+      <w:r>
+        <w:rPr>
+          <w:rFonts w:hint="eastAsia"/>
+          <w:b/>
+          <w:bCs/>
+        </w:rPr>
+        <w:t xml:space="preserve">怎么发：</w:t>
+      </w:r>
+      <w:r>
+        <w:t xml:space="preserve"> </w:t>
+      </w:r>
+      <w:r>
+        <w:rPr>
+          <w:rFonts w:hint="eastAsia"/>
+        </w:rPr>
+        <w:t xml:space="preserve">公司已在宁波注册，不要当本周必发。有温州引荐或当面时再用。宁波的钱走天使引导基金（科技大脑），不要另建「宁波市资金」。</w:t>
+      </w:r>
+    </w:p>
+    <w:p>
+      <w:pPr>
+        <w:pStyle w:val="BodyText"/>
       </w:pPr>
       <w:r>
         <w:rPr>

</xml_diff>